<commit_message>
updated ASSDX4A Practical Assessment Report
</commit_message>
<xml_diff>
--- a/docs/report/ASSDX4A Practical Assessment Report.docx
+++ b/docs/report/ASSDX4A Practical Assessment Report.docx
@@ -44,7 +44,7 @@
                     </pic:cNvPicPr>
                   </pic:nvPicPr>
                   <pic:blipFill>
-                    <a:blip r:embed="rId6">
+                    <a:blip r:embed="rId7">
                       <a:extLst>
                         <a:ext uri="{28A0092B-C50C-407E-A947-70E740481C1C}">
                           <a14:useLocalDpi xmlns:a14="http://schemas.microsoft.com/office/drawing/2010/main" val="0"/>
@@ -643,8 +643,6 @@
               </w:rPr>
               <w:t>ASSDX4A DEVOPS PRACTICAL ASSESSMENT REPORT</w:t>
             </w:r>
-            <w:bookmarkStart w:id="0" w:name="_GoBack"/>
-            <w:bookmarkEnd w:id="0"/>
           </w:p>
         </w:tc>
       </w:tr>
@@ -723,54 +721,53 @@
     </w:p>
     <w:p>
       <w:pPr>
-        <w:spacing w:after="0" w:line="240" w:lineRule="auto"/>
-        <w:rPr>
-          <w:rFonts w:ascii="Verdana" w:eastAsia="Calibri" w:hAnsi="Verdana" w:cs="Arial"/>
+        <w:spacing w:after="200" w:line="276" w:lineRule="auto"/>
+        <w:rPr>
+          <w:rFonts w:ascii="Corbel" w:eastAsia="Calibri" w:hAnsi="Corbel" w:cs="Arial"/>
+          <w:b/>
           <w:kern w:val="0"/>
-          <w:sz w:val="24"/>
-          <w:szCs w:val="24"/>
+          <w:sz w:val="32"/>
+          <w:szCs w:val="32"/>
           <w14:ligatures w14:val="none"/>
         </w:rPr>
       </w:pPr>
     </w:p>
     <w:tbl>
       <w:tblPr>
-        <w:tblStyle w:val="TableGrid1"/>
-        <w:tblW w:w="10490" w:type="dxa"/>
-        <w:tblInd w:w="-714" w:type="dxa"/>
+        <w:tblStyle w:val="TableGrid"/>
+        <w:tblW w:w="9493" w:type="dxa"/>
         <w:tblLook w:val="04A0" w:firstRow="1" w:lastRow="0" w:firstColumn="1" w:lastColumn="0" w:noHBand="0" w:noVBand="1"/>
       </w:tblPr>
       <w:tblGrid>
-        <w:gridCol w:w="3471"/>
-        <w:gridCol w:w="4291"/>
-        <w:gridCol w:w="2728"/>
+        <w:gridCol w:w="2405"/>
+        <w:gridCol w:w="3119"/>
+        <w:gridCol w:w="1984"/>
+        <w:gridCol w:w="1985"/>
       </w:tblGrid>
       <w:tr>
-        <w:trPr>
-          <w:trHeight w:val="649"/>
-        </w:trPr>
-        <w:tc>
-          <w:tcPr>
-            <w:tcW w:w="3471" w:type="dxa"/>
-            <w:vAlign w:val="center"/>
-          </w:tcPr>
-          <w:p>
-            <w:pPr>
-              <w:jc w:val="center"/>
-              <w:rPr>
-                <w:rFonts w:ascii="Verdana" w:eastAsia="Calibri" w:hAnsi="Verdana" w:cs="Times New Roman"/>
+        <w:tc>
+          <w:tcPr>
+            <w:tcW w:w="2405" w:type="dxa"/>
+          </w:tcPr>
+          <w:p>
+            <w:pPr>
+              <w:spacing w:after="200" w:line="276" w:lineRule="auto"/>
+              <w:rPr>
+                <w:rFonts w:ascii="Corbel" w:eastAsia="Calibri" w:hAnsi="Corbel" w:cs="Arial"/>
                 <w:b/>
-                <w:sz w:val="28"/>
-                <w:szCs w:val="28"/>
+                <w:kern w:val="0"/>
+                <w:sz w:val="24"/>
+                <w:szCs w:val="24"/>
                 <w14:ligatures w14:val="none"/>
               </w:rPr>
             </w:pPr>
             <w:r>
               <w:rPr>
-                <w:rFonts w:ascii="Verdana" w:eastAsia="Calibri" w:hAnsi="Verdana" w:cs="Times New Roman"/>
+                <w:rFonts w:ascii="Corbel" w:eastAsia="Calibri" w:hAnsi="Corbel" w:cs="Arial"/>
                 <w:b/>
-                <w:sz w:val="28"/>
-                <w:szCs w:val="28"/>
+                <w:kern w:val="0"/>
+                <w:sz w:val="24"/>
+                <w:szCs w:val="24"/>
                 <w14:ligatures w14:val="none"/>
               </w:rPr>
               <w:t>STUDENT NUMBER</w:t>
@@ -779,64 +776,85 @@
         </w:tc>
         <w:tc>
           <w:tcPr>
-            <w:tcW w:w="4291" w:type="dxa"/>
-            <w:vAlign w:val="center"/>
-          </w:tcPr>
-          <w:p>
-            <w:pPr>
-              <w:jc w:val="center"/>
-              <w:rPr>
-                <w:rFonts w:ascii="Verdana" w:eastAsia="Calibri" w:hAnsi="Verdana" w:cs="Times New Roman"/>
+            <w:tcW w:w="3119" w:type="dxa"/>
+          </w:tcPr>
+          <w:p>
+            <w:pPr>
+              <w:spacing w:after="200" w:line="276" w:lineRule="auto"/>
+              <w:rPr>
+                <w:rFonts w:ascii="Corbel" w:eastAsia="Calibri" w:hAnsi="Corbel" w:cs="Arial"/>
                 <w:b/>
-                <w:sz w:val="28"/>
-                <w:szCs w:val="28"/>
+                <w:kern w:val="0"/>
+                <w:sz w:val="24"/>
+                <w:szCs w:val="24"/>
                 <w14:ligatures w14:val="none"/>
               </w:rPr>
             </w:pPr>
             <w:r>
               <w:rPr>
-                <w:rFonts w:ascii="Verdana" w:eastAsia="Calibri" w:hAnsi="Verdana" w:cs="Times New Roman"/>
+                <w:rFonts w:ascii="Corbel" w:eastAsia="Calibri" w:hAnsi="Corbel" w:cs="Arial"/>
                 <w:b/>
-                <w:sz w:val="28"/>
-                <w:szCs w:val="28"/>
+                <w:kern w:val="0"/>
+                <w:sz w:val="24"/>
+                <w:szCs w:val="24"/>
                 <w14:ligatures w14:val="none"/>
               </w:rPr>
-              <w:t>SURNAME</w:t>
-            </w:r>
-            <w:r>
-              <w:rPr>
-                <w:rFonts w:ascii="Verdana" w:eastAsia="Calibri" w:hAnsi="Verdana" w:cs="Times New Roman"/>
+              <w:t>SURNAME AND INITIALS</w:t>
+            </w:r>
+          </w:p>
+        </w:tc>
+        <w:tc>
+          <w:tcPr>
+            <w:tcW w:w="1984" w:type="dxa"/>
+          </w:tcPr>
+          <w:p>
+            <w:pPr>
+              <w:spacing w:after="200" w:line="276" w:lineRule="auto"/>
+              <w:rPr>
+                <w:rFonts w:ascii="Corbel" w:eastAsia="Calibri" w:hAnsi="Corbel" w:cs="Arial"/>
                 <w:b/>
-                <w:sz w:val="28"/>
-                <w:szCs w:val="28"/>
+                <w:kern w:val="0"/>
+                <w:sz w:val="24"/>
+                <w:szCs w:val="24"/>
                 <w14:ligatures w14:val="none"/>
               </w:rPr>
-              <w:t xml:space="preserve"> AND INITIALS</w:t>
-            </w:r>
-          </w:p>
-        </w:tc>
-        <w:tc>
-          <w:tcPr>
-            <w:tcW w:w="2728" w:type="dxa"/>
-            <w:vAlign w:val="center"/>
-          </w:tcPr>
-          <w:p>
-            <w:pPr>
-              <w:jc w:val="center"/>
-              <w:rPr>
-                <w:rFonts w:ascii="Verdana" w:eastAsia="Calibri" w:hAnsi="Verdana" w:cs="Times New Roman"/>
+            </w:pPr>
+            <w:r>
+              <w:rPr>
+                <w:rFonts w:ascii="Corbel" w:eastAsia="Calibri" w:hAnsi="Corbel" w:cs="Arial"/>
                 <w:b/>
-                <w:sz w:val="28"/>
-                <w:szCs w:val="28"/>
+                <w:kern w:val="0"/>
+                <w:sz w:val="24"/>
+                <w:szCs w:val="24"/>
                 <w14:ligatures w14:val="none"/>
               </w:rPr>
-            </w:pPr>
-            <w:r>
-              <w:rPr>
-                <w:rFonts w:ascii="Verdana" w:eastAsia="Calibri" w:hAnsi="Verdana" w:cs="Times New Roman"/>
+              <w:t>ROLE</w:t>
+            </w:r>
+          </w:p>
+        </w:tc>
+        <w:tc>
+          <w:tcPr>
+            <w:tcW w:w="1985" w:type="dxa"/>
+          </w:tcPr>
+          <w:p>
+            <w:pPr>
+              <w:spacing w:after="200" w:line="276" w:lineRule="auto"/>
+              <w:rPr>
+                <w:rFonts w:ascii="Corbel" w:eastAsia="Calibri" w:hAnsi="Corbel" w:cs="Arial"/>
                 <w:b/>
-                <w:sz w:val="28"/>
-                <w:szCs w:val="28"/>
+                <w:kern w:val="0"/>
+                <w:sz w:val="24"/>
+                <w:szCs w:val="24"/>
+                <w14:ligatures w14:val="none"/>
+              </w:rPr>
+            </w:pPr>
+            <w:r>
+              <w:rPr>
+                <w:rFonts w:ascii="Corbel" w:eastAsia="Calibri" w:hAnsi="Corbel" w:cs="Arial"/>
+                <w:b/>
+                <w:kern w:val="0"/>
+                <w:sz w:val="24"/>
+                <w:szCs w:val="24"/>
                 <w14:ligatures w14:val="none"/>
               </w:rPr>
               <w:t>SIGNATURE</w:t>
@@ -845,19 +863,16 @@
         </w:tc>
       </w:tr>
       <w:tr>
-        <w:trPr>
-          <w:trHeight w:val="675"/>
-        </w:trPr>
-        <w:tc>
-          <w:tcPr>
-            <w:tcW w:w="3471" w:type="dxa"/>
-            <w:vAlign w:val="center"/>
-          </w:tcPr>
-          <w:p>
-            <w:pPr>
-              <w:rPr>
-                <w:rFonts w:ascii="Verdana" w:eastAsia="Calibri" w:hAnsi="Verdana" w:cs="Times New Roman"/>
-                <w:bCs/>
+        <w:tc>
+          <w:tcPr>
+            <w:tcW w:w="2405" w:type="dxa"/>
+          </w:tcPr>
+          <w:p>
+            <w:pPr>
+              <w:spacing w:after="200" w:line="276" w:lineRule="auto"/>
+              <w:rPr>
+                <w:rFonts w:ascii="Arial" w:eastAsia="Calibri" w:hAnsi="Arial" w:cs="Arial"/>
+                <w:kern w:val="0"/>
                 <w:sz w:val="24"/>
                 <w:szCs w:val="24"/>
                 <w14:ligatures w14:val="none"/>
@@ -865,55 +880,95 @@
             </w:pPr>
             <w:r>
               <w:rPr>
-                <w:rFonts w:ascii="Verdana" w:eastAsia="Calibri" w:hAnsi="Verdana" w:cs="Times New Roman"/>
-                <w:bCs/>
+                <w:rFonts w:ascii="Arial" w:eastAsia="Calibri" w:hAnsi="Arial" w:cs="Arial"/>
+                <w:kern w:val="0"/>
                 <w:sz w:val="24"/>
                 <w:szCs w:val="24"/>
                 <w14:ligatures w14:val="none"/>
               </w:rPr>
-              <w:t xml:space="preserve">          </w:t>
-            </w:r>
-          </w:p>
-        </w:tc>
-        <w:tc>
-          <w:tcPr>
-            <w:tcW w:w="4291" w:type="dxa"/>
-            <w:vAlign w:val="center"/>
-          </w:tcPr>
-          <w:p>
-            <w:pPr>
-              <w:rPr>
-                <w:rFonts w:ascii="Verdana" w:eastAsia="Calibri" w:hAnsi="Verdana" w:cs="Times New Roman"/>
-                <w:bCs/>
+              <w:t>223019267</w:t>
+            </w:r>
+          </w:p>
+        </w:tc>
+        <w:tc>
+          <w:tcPr>
+            <w:tcW w:w="3119" w:type="dxa"/>
+          </w:tcPr>
+          <w:p>
+            <w:pPr>
+              <w:spacing w:after="200" w:line="276" w:lineRule="auto"/>
+              <w:rPr>
+                <w:rFonts w:ascii="Arial" w:eastAsia="Calibri" w:hAnsi="Arial" w:cs="Arial"/>
+                <w:kern w:val="0"/>
                 <w:sz w:val="24"/>
                 <w:szCs w:val="24"/>
                 <w14:ligatures w14:val="none"/>
               </w:rPr>
             </w:pPr>
-            <w:r>
-              <w:rPr>
-                <w:rFonts w:ascii="Verdana" w:eastAsia="Calibri" w:hAnsi="Verdana" w:cs="Times New Roman"/>
-                <w:bCs/>
+            <w:proofErr w:type="spellStart"/>
+            <w:r>
+              <w:rPr>
+                <w:rFonts w:ascii="Arial" w:eastAsia="Calibri" w:hAnsi="Arial" w:cs="Arial"/>
+                <w:kern w:val="0"/>
                 <w:sz w:val="24"/>
                 <w:szCs w:val="24"/>
                 <w14:ligatures w14:val="none"/>
               </w:rPr>
-              <w:t xml:space="preserve">                 </w:t>
-            </w:r>
-          </w:p>
-        </w:tc>
-        <w:tc>
-          <w:tcPr>
-            <w:tcW w:w="2728" w:type="dxa"/>
-            <w:vAlign w:val="center"/>
-          </w:tcPr>
-          <w:p>
-            <w:pPr>
-              <w:jc w:val="center"/>
-              <w:rPr>
-                <w:rFonts w:ascii="Verdana" w:eastAsia="Calibri" w:hAnsi="Verdana" w:cs="Times New Roman"/>
-                <w:sz w:val="24"/>
-                <w:szCs w:val="24"/>
+              <w:t>Ravele</w:t>
+            </w:r>
+            <w:proofErr w:type="spellEnd"/>
+            <w:r>
+              <w:rPr>
+                <w:rFonts w:ascii="Arial" w:eastAsia="Calibri" w:hAnsi="Arial" w:cs="Arial"/>
+                <w:kern w:val="0"/>
+                <w:sz w:val="24"/>
+                <w:szCs w:val="24"/>
+                <w14:ligatures w14:val="none"/>
+              </w:rPr>
+              <w:t xml:space="preserve"> W</w:t>
+            </w:r>
+          </w:p>
+        </w:tc>
+        <w:tc>
+          <w:tcPr>
+            <w:tcW w:w="1984" w:type="dxa"/>
+          </w:tcPr>
+          <w:p>
+            <w:pPr>
+              <w:spacing w:after="200" w:line="276" w:lineRule="auto"/>
+              <w:rPr>
+                <w:rFonts w:ascii="Arial" w:eastAsia="Calibri" w:hAnsi="Arial" w:cs="Arial"/>
+                <w:kern w:val="0"/>
+                <w:sz w:val="24"/>
+                <w:szCs w:val="24"/>
+                <w14:ligatures w14:val="none"/>
+              </w:rPr>
+            </w:pPr>
+            <w:r>
+              <w:rPr>
+                <w:rFonts w:ascii="Arial" w:eastAsia="Calibri" w:hAnsi="Arial" w:cs="Arial"/>
+                <w:kern w:val="0"/>
+                <w:sz w:val="24"/>
+                <w:szCs w:val="24"/>
+                <w14:ligatures w14:val="none"/>
+              </w:rPr>
+              <w:t>Git Leader</w:t>
+            </w:r>
+          </w:p>
+        </w:tc>
+        <w:tc>
+          <w:tcPr>
+            <w:tcW w:w="1985" w:type="dxa"/>
+          </w:tcPr>
+          <w:p>
+            <w:pPr>
+              <w:spacing w:after="200" w:line="276" w:lineRule="auto"/>
+              <w:rPr>
+                <w:rFonts w:ascii="Corbel" w:eastAsia="Calibri" w:hAnsi="Corbel" w:cs="Arial"/>
+                <w:b/>
+                <w:kern w:val="0"/>
+                <w:sz w:val="32"/>
+                <w:szCs w:val="32"/>
                 <w14:ligatures w14:val="none"/>
               </w:rPr>
             </w:pPr>
@@ -921,19 +976,16 @@
         </w:tc>
       </w:tr>
       <w:tr>
-        <w:trPr>
-          <w:trHeight w:val="720"/>
-        </w:trPr>
-        <w:tc>
-          <w:tcPr>
-            <w:tcW w:w="3471" w:type="dxa"/>
-            <w:vAlign w:val="center"/>
-          </w:tcPr>
-          <w:p>
-            <w:pPr>
-              <w:rPr>
-                <w:rFonts w:ascii="Verdana" w:eastAsia="Calibri" w:hAnsi="Verdana" w:cs="Times New Roman"/>
-                <w:bCs/>
+        <w:tc>
+          <w:tcPr>
+            <w:tcW w:w="2405" w:type="dxa"/>
+          </w:tcPr>
+          <w:p>
+            <w:pPr>
+              <w:spacing w:after="200" w:line="276" w:lineRule="auto"/>
+              <w:rPr>
+                <w:rFonts w:ascii="Arial" w:eastAsia="Calibri" w:hAnsi="Arial" w:cs="Arial"/>
+                <w:kern w:val="0"/>
                 <w:sz w:val="24"/>
                 <w:szCs w:val="24"/>
                 <w14:ligatures w14:val="none"/>
@@ -941,26 +993,26 @@
             </w:pPr>
             <w:r>
               <w:rPr>
-                <w:rFonts w:ascii="Verdana" w:eastAsia="Calibri" w:hAnsi="Verdana" w:cs="Times New Roman"/>
-                <w:bCs/>
+                <w:rFonts w:ascii="Arial" w:eastAsia="Calibri" w:hAnsi="Arial" w:cs="Arial"/>
+                <w:kern w:val="0"/>
                 <w:sz w:val="24"/>
                 <w:szCs w:val="24"/>
                 <w14:ligatures w14:val="none"/>
               </w:rPr>
-              <w:t xml:space="preserve">          </w:t>
-            </w:r>
-          </w:p>
-        </w:tc>
-        <w:tc>
-          <w:tcPr>
-            <w:tcW w:w="4291" w:type="dxa"/>
-            <w:vAlign w:val="center"/>
-          </w:tcPr>
-          <w:p>
-            <w:pPr>
-              <w:rPr>
-                <w:rFonts w:ascii="Verdana" w:eastAsia="Calibri" w:hAnsi="Verdana" w:cs="Times New Roman"/>
-                <w:bCs/>
+              <w:t>223430145</w:t>
+            </w:r>
+          </w:p>
+        </w:tc>
+        <w:tc>
+          <w:tcPr>
+            <w:tcW w:w="3119" w:type="dxa"/>
+          </w:tcPr>
+          <w:p>
+            <w:pPr>
+              <w:spacing w:after="200" w:line="276" w:lineRule="auto"/>
+              <w:rPr>
+                <w:rFonts w:ascii="Arial" w:eastAsia="Calibri" w:hAnsi="Arial" w:cs="Arial"/>
+                <w:kern w:val="0"/>
                 <w:sz w:val="24"/>
                 <w:szCs w:val="24"/>
                 <w14:ligatures w14:val="none"/>
@@ -968,28 +1020,56 @@
             </w:pPr>
             <w:r>
               <w:rPr>
-                <w:rFonts w:ascii="Verdana" w:eastAsia="Calibri" w:hAnsi="Verdana" w:cs="Times New Roman"/>
-                <w:bCs/>
+                <w:rFonts w:ascii="Arial" w:eastAsia="Calibri" w:hAnsi="Arial" w:cs="Arial"/>
+                <w:kern w:val="0"/>
                 <w:sz w:val="24"/>
                 <w:szCs w:val="24"/>
                 <w14:ligatures w14:val="none"/>
               </w:rPr>
-              <w:t xml:space="preserve">                 </w:t>
-            </w:r>
-          </w:p>
-        </w:tc>
-        <w:tc>
-          <w:tcPr>
-            <w:tcW w:w="2728" w:type="dxa"/>
-            <w:vAlign w:val="center"/>
-          </w:tcPr>
-          <w:p>
-            <w:pPr>
-              <w:jc w:val="center"/>
-              <w:rPr>
-                <w:rFonts w:ascii="Verdana" w:eastAsia="Calibri" w:hAnsi="Verdana" w:cs="Times New Roman"/>
-                <w:sz w:val="24"/>
-                <w:szCs w:val="24"/>
+              <w:t>Shaun S</w:t>
+            </w:r>
+          </w:p>
+        </w:tc>
+        <w:tc>
+          <w:tcPr>
+            <w:tcW w:w="1984" w:type="dxa"/>
+          </w:tcPr>
+          <w:p>
+            <w:pPr>
+              <w:spacing w:after="200" w:line="276" w:lineRule="auto"/>
+              <w:rPr>
+                <w:rFonts w:ascii="Arial" w:eastAsia="Calibri" w:hAnsi="Arial" w:cs="Arial"/>
+                <w:kern w:val="0"/>
+                <w:sz w:val="24"/>
+                <w:szCs w:val="24"/>
+                <w14:ligatures w14:val="none"/>
+              </w:rPr>
+            </w:pPr>
+            <w:r>
+              <w:rPr>
+                <w:rFonts w:ascii="Arial" w:eastAsia="Calibri" w:hAnsi="Arial" w:cs="Arial"/>
+                <w:kern w:val="0"/>
+                <w:sz w:val="24"/>
+                <w:szCs w:val="24"/>
+                <w14:ligatures w14:val="none"/>
+              </w:rPr>
+              <w:t>CI Engineer</w:t>
+            </w:r>
+          </w:p>
+        </w:tc>
+        <w:tc>
+          <w:tcPr>
+            <w:tcW w:w="1985" w:type="dxa"/>
+          </w:tcPr>
+          <w:p>
+            <w:pPr>
+              <w:spacing w:after="200" w:line="276" w:lineRule="auto"/>
+              <w:rPr>
+                <w:rFonts w:ascii="Corbel" w:eastAsia="Calibri" w:hAnsi="Corbel" w:cs="Arial"/>
+                <w:b/>
+                <w:kern w:val="0"/>
+                <w:sz w:val="32"/>
+                <w:szCs w:val="32"/>
                 <w14:ligatures w14:val="none"/>
               </w:rPr>
             </w:pPr>
@@ -997,56 +1077,112 @@
         </w:tc>
       </w:tr>
       <w:tr>
-        <w:trPr>
-          <w:trHeight w:val="660"/>
-        </w:trPr>
-        <w:tc>
-          <w:tcPr>
-            <w:tcW w:w="3471" w:type="dxa"/>
-            <w:vAlign w:val="center"/>
-          </w:tcPr>
-          <w:p>
-            <w:pPr>
-              <w:rPr>
-                <w:rFonts w:ascii="Verdana" w:eastAsia="Calibri" w:hAnsi="Verdana" w:cs="Times New Roman"/>
-                <w:bCs/>
+        <w:tc>
+          <w:tcPr>
+            <w:tcW w:w="2405" w:type="dxa"/>
+          </w:tcPr>
+          <w:p>
+            <w:pPr>
+              <w:spacing w:after="200" w:line="276" w:lineRule="auto"/>
+              <w:rPr>
+                <w:rFonts w:ascii="Arial" w:eastAsia="Calibri" w:hAnsi="Arial" w:cs="Arial"/>
+                <w:kern w:val="0"/>
                 <w:sz w:val="24"/>
                 <w:szCs w:val="24"/>
                 <w14:ligatures w14:val="none"/>
               </w:rPr>
             </w:pPr>
-          </w:p>
-        </w:tc>
-        <w:tc>
-          <w:tcPr>
-            <w:tcW w:w="4291" w:type="dxa"/>
-            <w:vAlign w:val="center"/>
-          </w:tcPr>
-          <w:p>
-            <w:pPr>
-              <w:jc w:val="center"/>
-              <w:rPr>
-                <w:rFonts w:ascii="Verdana" w:eastAsia="Calibri" w:hAnsi="Verdana" w:cs="Times New Roman"/>
-                <w:bCs/>
+            <w:r>
+              <w:rPr>
+                <w:rFonts w:ascii="Arial" w:eastAsia="Calibri" w:hAnsi="Arial" w:cs="Arial"/>
+                <w:kern w:val="0"/>
                 <w:sz w:val="24"/>
                 <w:szCs w:val="24"/>
                 <w14:ligatures w14:val="none"/>
               </w:rPr>
-            </w:pPr>
-          </w:p>
-        </w:tc>
-        <w:tc>
-          <w:tcPr>
-            <w:tcW w:w="2728" w:type="dxa"/>
-            <w:vAlign w:val="center"/>
-          </w:tcPr>
-          <w:p>
-            <w:pPr>
-              <w:jc w:val="center"/>
-              <w:rPr>
-                <w:rFonts w:ascii="Verdana" w:eastAsia="Calibri" w:hAnsi="Verdana" w:cs="Times New Roman"/>
-                <w:sz w:val="24"/>
-                <w:szCs w:val="24"/>
+              <w:t>224062565</w:t>
+            </w:r>
+          </w:p>
+        </w:tc>
+        <w:tc>
+          <w:tcPr>
+            <w:tcW w:w="3119" w:type="dxa"/>
+          </w:tcPr>
+          <w:p>
+            <w:pPr>
+              <w:spacing w:after="200" w:line="276" w:lineRule="auto"/>
+              <w:rPr>
+                <w:rFonts w:ascii="Arial" w:eastAsia="Calibri" w:hAnsi="Arial" w:cs="Arial"/>
+                <w:kern w:val="0"/>
+                <w:sz w:val="24"/>
+                <w:szCs w:val="24"/>
+                <w14:ligatures w14:val="none"/>
+              </w:rPr>
+            </w:pPr>
+            <w:proofErr w:type="spellStart"/>
+            <w:r>
+              <w:rPr>
+                <w:rFonts w:ascii="Arial" w:eastAsia="Calibri" w:hAnsi="Arial" w:cs="Arial"/>
+                <w:kern w:val="0"/>
+                <w:sz w:val="24"/>
+                <w:szCs w:val="24"/>
+                <w14:ligatures w14:val="none"/>
+              </w:rPr>
+              <w:t>Motlatso</w:t>
+            </w:r>
+            <w:proofErr w:type="spellEnd"/>
+            <w:r>
+              <w:rPr>
+                <w:rFonts w:ascii="Arial" w:eastAsia="Calibri" w:hAnsi="Arial" w:cs="Arial"/>
+                <w:kern w:val="0"/>
+                <w:sz w:val="24"/>
+                <w:szCs w:val="24"/>
+                <w14:ligatures w14:val="none"/>
+              </w:rPr>
+              <w:t xml:space="preserve"> M</w:t>
+            </w:r>
+          </w:p>
+        </w:tc>
+        <w:tc>
+          <w:tcPr>
+            <w:tcW w:w="1984" w:type="dxa"/>
+          </w:tcPr>
+          <w:p>
+            <w:pPr>
+              <w:spacing w:after="200" w:line="276" w:lineRule="auto"/>
+              <w:rPr>
+                <w:rFonts w:ascii="Arial" w:eastAsia="Calibri" w:hAnsi="Arial" w:cs="Arial"/>
+                <w:kern w:val="0"/>
+                <w:sz w:val="24"/>
+                <w:szCs w:val="24"/>
+                <w14:ligatures w14:val="none"/>
+              </w:rPr>
+            </w:pPr>
+            <w:r>
+              <w:rPr>
+                <w:rFonts w:ascii="Arial" w:eastAsia="Calibri" w:hAnsi="Arial" w:cs="Arial"/>
+                <w:kern w:val="0"/>
+                <w:sz w:val="24"/>
+                <w:szCs w:val="24"/>
+                <w14:ligatures w14:val="none"/>
+              </w:rPr>
+              <w:t>Deployment Lead</w:t>
+            </w:r>
+          </w:p>
+        </w:tc>
+        <w:tc>
+          <w:tcPr>
+            <w:tcW w:w="1985" w:type="dxa"/>
+          </w:tcPr>
+          <w:p>
+            <w:pPr>
+              <w:spacing w:after="200" w:line="276" w:lineRule="auto"/>
+              <w:rPr>
+                <w:rFonts w:ascii="Corbel" w:eastAsia="Calibri" w:hAnsi="Corbel" w:cs="Arial"/>
+                <w:b/>
+                <w:kern w:val="0"/>
+                <w:sz w:val="32"/>
+                <w:szCs w:val="32"/>
                 <w14:ligatures w14:val="none"/>
               </w:rPr>
             </w:pPr>
@@ -1054,55 +1190,112 @@
         </w:tc>
       </w:tr>
       <w:tr>
-        <w:trPr>
-          <w:trHeight w:val="705"/>
-        </w:trPr>
-        <w:tc>
-          <w:tcPr>
-            <w:tcW w:w="3471" w:type="dxa"/>
-            <w:vAlign w:val="center"/>
-          </w:tcPr>
-          <w:p>
-            <w:pPr>
-              <w:rPr>
-                <w:rFonts w:ascii="Verdana" w:eastAsia="Calibri" w:hAnsi="Verdana" w:cs="Times New Roman"/>
-                <w:bCs/>
+        <w:tc>
+          <w:tcPr>
+            <w:tcW w:w="2405" w:type="dxa"/>
+          </w:tcPr>
+          <w:p>
+            <w:pPr>
+              <w:spacing w:after="200" w:line="276" w:lineRule="auto"/>
+              <w:rPr>
+                <w:rFonts w:ascii="Arial" w:eastAsia="Calibri" w:hAnsi="Arial" w:cs="Arial"/>
+                <w:kern w:val="0"/>
                 <w:sz w:val="24"/>
                 <w:szCs w:val="24"/>
                 <w14:ligatures w14:val="none"/>
               </w:rPr>
             </w:pPr>
-          </w:p>
-        </w:tc>
-        <w:tc>
-          <w:tcPr>
-            <w:tcW w:w="4291" w:type="dxa"/>
-            <w:vAlign w:val="center"/>
-          </w:tcPr>
-          <w:p>
-            <w:pPr>
-              <w:rPr>
-                <w:rFonts w:ascii="Verdana" w:eastAsia="Calibri" w:hAnsi="Verdana" w:cs="Times New Roman"/>
-                <w:bCs/>
+            <w:r>
+              <w:rPr>
+                <w:rFonts w:ascii="Arial" w:eastAsia="Calibri" w:hAnsi="Arial" w:cs="Arial"/>
+                <w:kern w:val="0"/>
                 <w:sz w:val="24"/>
                 <w:szCs w:val="24"/>
                 <w14:ligatures w14:val="none"/>
               </w:rPr>
-            </w:pPr>
-          </w:p>
-        </w:tc>
-        <w:tc>
-          <w:tcPr>
-            <w:tcW w:w="2728" w:type="dxa"/>
-            <w:vAlign w:val="center"/>
-          </w:tcPr>
-          <w:p>
-            <w:pPr>
-              <w:jc w:val="center"/>
-              <w:rPr>
-                <w:rFonts w:ascii="Verdana" w:eastAsia="Calibri" w:hAnsi="Verdana" w:cs="Times New Roman"/>
-                <w:sz w:val="24"/>
-                <w:szCs w:val="24"/>
+              <w:t>222476400</w:t>
+            </w:r>
+          </w:p>
+        </w:tc>
+        <w:tc>
+          <w:tcPr>
+            <w:tcW w:w="3119" w:type="dxa"/>
+          </w:tcPr>
+          <w:p>
+            <w:pPr>
+              <w:spacing w:after="200" w:line="276" w:lineRule="auto"/>
+              <w:rPr>
+                <w:rFonts w:ascii="Arial" w:eastAsia="Calibri" w:hAnsi="Arial" w:cs="Arial"/>
+                <w:kern w:val="0"/>
+                <w:sz w:val="24"/>
+                <w:szCs w:val="24"/>
+                <w14:ligatures w14:val="none"/>
+              </w:rPr>
+            </w:pPr>
+            <w:proofErr w:type="spellStart"/>
+            <w:r>
+              <w:rPr>
+                <w:rFonts w:ascii="Arial" w:eastAsia="Calibri" w:hAnsi="Arial" w:cs="Arial"/>
+                <w:kern w:val="0"/>
+                <w:sz w:val="24"/>
+                <w:szCs w:val="24"/>
+                <w14:ligatures w14:val="none"/>
+              </w:rPr>
+              <w:t>Phalane</w:t>
+            </w:r>
+            <w:proofErr w:type="spellEnd"/>
+            <w:r>
+              <w:rPr>
+                <w:rFonts w:ascii="Arial" w:eastAsia="Calibri" w:hAnsi="Arial" w:cs="Arial"/>
+                <w:kern w:val="0"/>
+                <w:sz w:val="24"/>
+                <w:szCs w:val="24"/>
+                <w14:ligatures w14:val="none"/>
+              </w:rPr>
+              <w:t xml:space="preserve"> RM</w:t>
+            </w:r>
+          </w:p>
+        </w:tc>
+        <w:tc>
+          <w:tcPr>
+            <w:tcW w:w="1984" w:type="dxa"/>
+          </w:tcPr>
+          <w:p>
+            <w:pPr>
+              <w:spacing w:after="200" w:line="276" w:lineRule="auto"/>
+              <w:rPr>
+                <w:rFonts w:ascii="Arial" w:eastAsia="Calibri" w:hAnsi="Arial" w:cs="Arial"/>
+                <w:kern w:val="0"/>
+                <w:sz w:val="24"/>
+                <w:szCs w:val="24"/>
+                <w14:ligatures w14:val="none"/>
+              </w:rPr>
+            </w:pPr>
+            <w:r>
+              <w:rPr>
+                <w:rFonts w:ascii="Arial" w:eastAsia="Calibri" w:hAnsi="Arial" w:cs="Arial"/>
+                <w:kern w:val="0"/>
+                <w:sz w:val="24"/>
+                <w:szCs w:val="24"/>
+                <w14:ligatures w14:val="none"/>
+              </w:rPr>
+              <w:t>Bug Fix Engineer</w:t>
+            </w:r>
+          </w:p>
+        </w:tc>
+        <w:tc>
+          <w:tcPr>
+            <w:tcW w:w="1985" w:type="dxa"/>
+          </w:tcPr>
+          <w:p>
+            <w:pPr>
+              <w:spacing w:after="200" w:line="276" w:lineRule="auto"/>
+              <w:rPr>
+                <w:rFonts w:ascii="Corbel" w:eastAsia="Calibri" w:hAnsi="Corbel" w:cs="Arial"/>
+                <w:b/>
+                <w:kern w:val="0"/>
+                <w:sz w:val="32"/>
+                <w:szCs w:val="32"/>
                 <w14:ligatures w14:val="none"/>
               </w:rPr>
             </w:pPr>
@@ -1110,111 +1303,112 @@
         </w:tc>
       </w:tr>
       <w:tr>
-        <w:trPr>
-          <w:trHeight w:val="795"/>
-        </w:trPr>
-        <w:tc>
-          <w:tcPr>
-            <w:tcW w:w="3471" w:type="dxa"/>
-            <w:vAlign w:val="center"/>
-          </w:tcPr>
-          <w:p>
-            <w:pPr>
-              <w:rPr>
-                <w:rFonts w:ascii="Verdana" w:eastAsia="Calibri" w:hAnsi="Verdana" w:cs="Times New Roman"/>
-                <w:bCs/>
+        <w:tc>
+          <w:tcPr>
+            <w:tcW w:w="2405" w:type="dxa"/>
+          </w:tcPr>
+          <w:p>
+            <w:pPr>
+              <w:spacing w:after="200" w:line="276" w:lineRule="auto"/>
+              <w:rPr>
+                <w:rFonts w:ascii="Arial" w:eastAsia="Calibri" w:hAnsi="Arial" w:cs="Arial"/>
+                <w:kern w:val="0"/>
                 <w:sz w:val="24"/>
                 <w:szCs w:val="24"/>
                 <w14:ligatures w14:val="none"/>
               </w:rPr>
             </w:pPr>
-          </w:p>
-        </w:tc>
-        <w:tc>
-          <w:tcPr>
-            <w:tcW w:w="4291" w:type="dxa"/>
-            <w:vAlign w:val="center"/>
-          </w:tcPr>
-          <w:p>
-            <w:pPr>
-              <w:rPr>
-                <w:rFonts w:ascii="Verdana" w:eastAsia="Calibri" w:hAnsi="Verdana" w:cs="Times New Roman"/>
+            <w:r>
+              <w:rPr>
+                <w:rFonts w:ascii="Arial" w:eastAsia="Calibri" w:hAnsi="Arial" w:cs="Arial"/>
+                <w:kern w:val="0"/>
                 <w:sz w:val="24"/>
                 <w:szCs w:val="24"/>
                 <w14:ligatures w14:val="none"/>
               </w:rPr>
-            </w:pPr>
-          </w:p>
-        </w:tc>
-        <w:tc>
-          <w:tcPr>
-            <w:tcW w:w="2728" w:type="dxa"/>
-            <w:vAlign w:val="center"/>
-          </w:tcPr>
-          <w:p>
-            <w:pPr>
-              <w:jc w:val="center"/>
-              <w:rPr>
-                <w:rFonts w:ascii="Verdana" w:eastAsia="Calibri" w:hAnsi="Verdana" w:cs="Times New Roman"/>
-                <w:bCs/>
+              <w:t>22379250</w:t>
+            </w:r>
+          </w:p>
+        </w:tc>
+        <w:tc>
+          <w:tcPr>
+            <w:tcW w:w="3119" w:type="dxa"/>
+          </w:tcPr>
+          <w:p>
+            <w:pPr>
+              <w:spacing w:after="200" w:line="276" w:lineRule="auto"/>
+              <w:rPr>
+                <w:rFonts w:ascii="Arial" w:eastAsia="Calibri" w:hAnsi="Arial" w:cs="Arial"/>
+                <w:kern w:val="0"/>
                 <w:sz w:val="24"/>
                 <w:szCs w:val="24"/>
                 <w14:ligatures w14:val="none"/>
               </w:rPr>
             </w:pPr>
-          </w:p>
-        </w:tc>
-      </w:tr>
-      <w:tr>
-        <w:trPr>
-          <w:trHeight w:val="810"/>
-        </w:trPr>
-        <w:tc>
-          <w:tcPr>
-            <w:tcW w:w="3471" w:type="dxa"/>
-            <w:vAlign w:val="center"/>
-          </w:tcPr>
-          <w:p>
-            <w:pPr>
-              <w:rPr>
-                <w:rFonts w:ascii="Verdana" w:eastAsia="Calibri" w:hAnsi="Verdana" w:cs="Times New Roman"/>
-                <w:bCs/>
+            <w:proofErr w:type="spellStart"/>
+            <w:r>
+              <w:rPr>
+                <w:rFonts w:ascii="Arial" w:eastAsia="Calibri" w:hAnsi="Arial" w:cs="Arial"/>
+                <w:kern w:val="0"/>
                 <w:sz w:val="24"/>
                 <w:szCs w:val="24"/>
                 <w14:ligatures w14:val="none"/>
               </w:rPr>
-            </w:pPr>
-          </w:p>
-        </w:tc>
-        <w:tc>
-          <w:tcPr>
-            <w:tcW w:w="4291" w:type="dxa"/>
-            <w:vAlign w:val="center"/>
-          </w:tcPr>
-          <w:p>
-            <w:pPr>
-              <w:rPr>
-                <w:rFonts w:ascii="Verdana" w:eastAsia="Calibri" w:hAnsi="Verdana" w:cs="Times New Roman"/>
-                <w:bCs/>
+              <w:t>Tshidiso</w:t>
+            </w:r>
+            <w:proofErr w:type="spellEnd"/>
+            <w:r>
+              <w:rPr>
+                <w:rFonts w:ascii="Arial" w:eastAsia="Calibri" w:hAnsi="Arial" w:cs="Arial"/>
+                <w:kern w:val="0"/>
                 <w:sz w:val="24"/>
                 <w:szCs w:val="24"/>
                 <w14:ligatures w14:val="none"/>
               </w:rPr>
-            </w:pPr>
-          </w:p>
-        </w:tc>
-        <w:tc>
-          <w:tcPr>
-            <w:tcW w:w="2728" w:type="dxa"/>
-            <w:vAlign w:val="center"/>
-          </w:tcPr>
-          <w:p>
-            <w:pPr>
-              <w:jc w:val="center"/>
-              <w:rPr>
-                <w:rFonts w:ascii="Verdana" w:eastAsia="Calibri" w:hAnsi="Verdana" w:cs="Times New Roman"/>
-                <w:sz w:val="24"/>
-                <w:szCs w:val="24"/>
+              <w:t xml:space="preserve"> T</w:t>
+            </w:r>
+          </w:p>
+        </w:tc>
+        <w:tc>
+          <w:tcPr>
+            <w:tcW w:w="1984" w:type="dxa"/>
+          </w:tcPr>
+          <w:p>
+            <w:pPr>
+              <w:spacing w:after="200" w:line="276" w:lineRule="auto"/>
+              <w:rPr>
+                <w:rFonts w:ascii="Arial" w:eastAsia="Calibri" w:hAnsi="Arial" w:cs="Arial"/>
+                <w:kern w:val="0"/>
+                <w:sz w:val="24"/>
+                <w:szCs w:val="24"/>
+                <w14:ligatures w14:val="none"/>
+              </w:rPr>
+            </w:pPr>
+            <w:r>
+              <w:rPr>
+                <w:rFonts w:ascii="Arial" w:eastAsia="Calibri" w:hAnsi="Arial" w:cs="Arial"/>
+                <w:kern w:val="0"/>
+                <w:sz w:val="24"/>
+                <w:szCs w:val="24"/>
+                <w14:ligatures w14:val="none"/>
+              </w:rPr>
+              <w:t>QA/Tester</w:t>
+            </w:r>
+          </w:p>
+        </w:tc>
+        <w:tc>
+          <w:tcPr>
+            <w:tcW w:w="1985" w:type="dxa"/>
+          </w:tcPr>
+          <w:p>
+            <w:pPr>
+              <w:spacing w:after="200" w:line="276" w:lineRule="auto"/>
+              <w:rPr>
+                <w:rFonts w:ascii="Corbel" w:eastAsia="Calibri" w:hAnsi="Corbel" w:cs="Arial"/>
+                <w:b/>
+                <w:kern w:val="0"/>
+                <w:sz w:val="32"/>
+                <w:szCs w:val="32"/>
                 <w14:ligatures w14:val="none"/>
               </w:rPr>
             </w:pPr>
@@ -1226,17 +1420,18 @@
       <w:pPr>
         <w:spacing w:after="200" w:line="276" w:lineRule="auto"/>
         <w:rPr>
-          <w:rFonts w:ascii="Arial" w:eastAsia="Calibri" w:hAnsi="Arial" w:cs="Arial"/>
+          <w:rFonts w:ascii="Corbel" w:eastAsia="Calibri" w:hAnsi="Corbel" w:cs="Arial"/>
+          <w:b/>
           <w:kern w:val="0"/>
-          <w:sz w:val="24"/>
-          <w:szCs w:val="24"/>
+          <w:sz w:val="32"/>
+          <w:szCs w:val="32"/>
           <w14:ligatures w14:val="none"/>
         </w:rPr>
         <w:sectPr>
-          <w:footerReference w:type="default" r:id="rId7"/>
-          <w:footerReference w:type="first" r:id="rId8"/>
-          <w:pgSz w:w="11906" w:h="16838"/>
-          <w:pgMar w:top="1440" w:right="1440" w:bottom="1440" w:left="1440" w:header="708" w:footer="708" w:gutter="0"/>
+          <w:footerReference w:type="default" r:id="rId8"/>
+          <w:footerReference w:type="first" r:id="rId9"/>
+          <w:pgSz w:w="11906" w:h="16838" w:code="9"/>
+          <w:pgMar w:top="1418" w:right="1418" w:bottom="2268" w:left="2268" w:header="709" w:footer="709" w:gutter="0"/>
           <w:pgNumType w:fmt="lowerRoman" w:start="1"/>
           <w:cols w:space="708"/>
           <w:titlePg/>
@@ -1245,6 +1440,3385 @@
       </w:pPr>
     </w:p>
     <w:p/>
+    <w:p/>
+    <w:p/>
+    <w:p/>
+    <w:p/>
+    <w:p/>
+    <w:p/>
+    <w:p/>
+    <w:p/>
+    <w:p/>
+    <w:p/>
+    <w:p/>
+    <w:p/>
+    <w:p/>
+    <w:p/>
+    <w:p/>
+    <w:p/>
+    <w:p/>
+    <w:p/>
+    <w:p/>
+    <w:p/>
+    <w:p/>
+    <w:p/>
+    <w:p/>
+    <w:p/>
+    <w:p/>
+    <w:p/>
+    <w:p/>
+    <w:p/>
+    <w:p>
+      <w:pPr>
+        <w:spacing w:line="360" w:lineRule="auto"/>
+        <w:jc w:val="both"/>
+        <w:rPr>
+          <w:rFonts w:ascii="Arial" w:hAnsi="Arial" w:cs="Arial"/>
+          <w:b/>
+          <w:sz w:val="28"/>
+          <w:szCs w:val="28"/>
+        </w:rPr>
+      </w:pPr>
+      <w:r>
+        <w:rPr>
+          <w:rFonts w:ascii="Arial" w:hAnsi="Arial" w:cs="Arial"/>
+          <w:b/>
+          <w:sz w:val="28"/>
+          <w:szCs w:val="28"/>
+        </w:rPr>
+        <w:lastRenderedPageBreak/>
+        <w:t>1. Introduction</w:t>
+      </w:r>
+    </w:p>
+    <w:p>
+      <w:pPr>
+        <w:spacing w:line="360" w:lineRule="auto"/>
+        <w:jc w:val="both"/>
+        <w:rPr>
+          <w:rFonts w:ascii="Arial" w:hAnsi="Arial" w:cs="Arial"/>
+          <w:b/>
+          <w:sz w:val="28"/>
+          <w:szCs w:val="28"/>
+        </w:rPr>
+      </w:pPr>
+    </w:p>
+    <w:p>
+      <w:pPr>
+        <w:spacing w:line="360" w:lineRule="auto"/>
+        <w:jc w:val="both"/>
+        <w:rPr>
+          <w:rFonts w:ascii="Arial" w:hAnsi="Arial" w:cs="Arial"/>
+          <w:sz w:val="24"/>
+          <w:szCs w:val="24"/>
+        </w:rPr>
+      </w:pPr>
+      <w:r>
+        <w:rPr>
+          <w:rFonts w:ascii="Arial" w:hAnsi="Arial" w:cs="Arial"/>
+          <w:sz w:val="24"/>
+          <w:szCs w:val="24"/>
+        </w:rPr>
+        <w:t xml:space="preserve">The goal of this practical assessment was to build a full complete Continuous Integration and Continuous Deployment (CI/CD) pipeline for a java web application called the student Grade Calculator. The assessment helped our group learn and apply DevOps tools and practices to automate software development tasks such as building, testing, </w:t>
+      </w:r>
+      <w:r>
+        <w:rPr>
+          <w:rFonts w:ascii="Arial" w:hAnsi="Arial" w:cs="Arial"/>
+          <w:sz w:val="24"/>
+          <w:szCs w:val="24"/>
+        </w:rPr>
+        <w:t>integration,</w:t>
+      </w:r>
+      <w:r>
+        <w:rPr>
+          <w:rFonts w:ascii="Arial" w:hAnsi="Arial" w:cs="Arial"/>
+          <w:sz w:val="24"/>
+          <w:szCs w:val="24"/>
+        </w:rPr>
+        <w:t xml:space="preserve"> </w:t>
+      </w:r>
+      <w:r>
+        <w:rPr>
+          <w:rFonts w:ascii="Arial" w:hAnsi="Arial" w:cs="Arial"/>
+          <w:sz w:val="24"/>
+          <w:szCs w:val="24"/>
+        </w:rPr>
+        <w:t>deployment,</w:t>
+      </w:r>
+      <w:r>
+        <w:rPr>
+          <w:rFonts w:ascii="Arial" w:hAnsi="Arial" w:cs="Arial"/>
+          <w:sz w:val="24"/>
+          <w:szCs w:val="24"/>
+        </w:rPr>
+        <w:t xml:space="preserve"> and teamwork.</w:t>
+      </w:r>
+    </w:p>
+    <w:p>
+      <w:pPr>
+        <w:spacing w:line="360" w:lineRule="auto"/>
+        <w:jc w:val="both"/>
+        <w:rPr>
+          <w:rFonts w:ascii="Arial" w:hAnsi="Arial" w:cs="Arial"/>
+          <w:sz w:val="24"/>
+          <w:szCs w:val="24"/>
+        </w:rPr>
+      </w:pPr>
+    </w:p>
+    <w:p>
+      <w:pPr>
+        <w:spacing w:line="360" w:lineRule="auto"/>
+        <w:jc w:val="both"/>
+        <w:rPr>
+          <w:rFonts w:ascii="Arial" w:hAnsi="Arial" w:cs="Arial"/>
+          <w:sz w:val="24"/>
+          <w:szCs w:val="24"/>
+        </w:rPr>
+      </w:pPr>
+      <w:r>
+        <w:rPr>
+          <w:rFonts w:ascii="Arial" w:hAnsi="Arial" w:cs="Arial"/>
+          <w:sz w:val="24"/>
+          <w:szCs w:val="24"/>
+        </w:rPr>
+        <w:t>During the assessment, the group used Git and GitHub for version control and collaboration, set up Continuous Integration using GitHub Actions and Jenkins, created automated tests to find bugs in the application, and fixed errors in the source code. The application was also containerised using Docker and deployed online using Render.com.</w:t>
+      </w:r>
+    </w:p>
+    <w:p>
+      <w:pPr>
+        <w:spacing w:line="360" w:lineRule="auto"/>
+        <w:jc w:val="both"/>
+        <w:rPr>
+          <w:rFonts w:ascii="Arial" w:hAnsi="Arial" w:cs="Arial"/>
+          <w:sz w:val="24"/>
+          <w:szCs w:val="24"/>
+        </w:rPr>
+      </w:pPr>
+    </w:p>
+    <w:p>
+      <w:pPr>
+        <w:spacing w:line="360" w:lineRule="auto"/>
+        <w:jc w:val="both"/>
+        <w:rPr>
+          <w:rFonts w:ascii="Arial" w:hAnsi="Arial" w:cs="Arial"/>
+          <w:sz w:val="24"/>
+          <w:szCs w:val="24"/>
+        </w:rPr>
+      </w:pPr>
+      <w:r>
+        <w:rPr>
+          <w:rFonts w:ascii="Arial" w:hAnsi="Arial" w:cs="Arial"/>
+          <w:sz w:val="24"/>
+          <w:szCs w:val="24"/>
+        </w:rPr>
+        <w:t>The group worked together using feature branches and pull requests. Overall, the project provided practical experience with modern DevOps tools and automated software delivery processes.</w:t>
+      </w:r>
+    </w:p>
+    <w:p>
+      <w:pPr>
+        <w:spacing w:line="360" w:lineRule="auto"/>
+        <w:jc w:val="both"/>
+        <w:rPr>
+          <w:rFonts w:ascii="Arial" w:hAnsi="Arial" w:cs="Arial"/>
+          <w:sz w:val="24"/>
+          <w:szCs w:val="24"/>
+        </w:rPr>
+      </w:pPr>
+    </w:p>
+    <w:p>
+      <w:pPr>
+        <w:spacing w:line="360" w:lineRule="auto"/>
+        <w:jc w:val="both"/>
+        <w:rPr>
+          <w:rFonts w:ascii="Arial" w:hAnsi="Arial" w:cs="Arial"/>
+          <w:b/>
+          <w:sz w:val="28"/>
+          <w:szCs w:val="28"/>
+        </w:rPr>
+      </w:pPr>
+      <w:r>
+        <w:rPr>
+          <w:rFonts w:ascii="Arial" w:hAnsi="Arial" w:cs="Arial"/>
+          <w:b/>
+          <w:sz w:val="28"/>
+          <w:szCs w:val="28"/>
+        </w:rPr>
+        <w:t>2. Application Description</w:t>
+      </w:r>
+    </w:p>
+    <w:p>
+      <w:pPr>
+        <w:spacing w:line="360" w:lineRule="auto"/>
+        <w:jc w:val="both"/>
+        <w:rPr>
+          <w:rFonts w:ascii="Arial" w:hAnsi="Arial" w:cs="Arial"/>
+          <w:sz w:val="24"/>
+          <w:szCs w:val="24"/>
+        </w:rPr>
+      </w:pPr>
+    </w:p>
+    <w:p>
+      <w:pPr>
+        <w:spacing w:line="360" w:lineRule="auto"/>
+        <w:jc w:val="both"/>
+        <w:rPr>
+          <w:rFonts w:ascii="Arial" w:hAnsi="Arial" w:cs="Arial"/>
+          <w:sz w:val="24"/>
+          <w:szCs w:val="24"/>
+        </w:rPr>
+      </w:pPr>
+      <w:r>
+        <w:rPr>
+          <w:rFonts w:ascii="Arial" w:hAnsi="Arial" w:cs="Arial"/>
+          <w:sz w:val="24"/>
+          <w:szCs w:val="24"/>
+        </w:rPr>
+        <w:t>The Student Grade Calculator is a Java web application used to calculate a student’s final mark using semester marks and examination marks. The application uses grading rules to determine the student’s final academic result, including distinctions, merits, credits, passes, failures, and supplementary examination eligibility. The system also checks the marks entered by the user to make sure they are between 0 and 100.</w:t>
+      </w:r>
+    </w:p>
+    <w:p>
+      <w:pPr>
+        <w:spacing w:line="360" w:lineRule="auto"/>
+        <w:jc w:val="both"/>
+        <w:rPr>
+          <w:rFonts w:ascii="Arial" w:hAnsi="Arial" w:cs="Arial"/>
+          <w:sz w:val="24"/>
+          <w:szCs w:val="24"/>
+        </w:rPr>
+      </w:pPr>
+    </w:p>
+    <w:p>
+      <w:pPr>
+        <w:spacing w:line="360" w:lineRule="auto"/>
+        <w:jc w:val="both"/>
+        <w:rPr>
+          <w:rFonts w:ascii="Arial" w:hAnsi="Arial" w:cs="Arial"/>
+          <w:sz w:val="24"/>
+          <w:szCs w:val="24"/>
+        </w:rPr>
+      </w:pPr>
+      <w:r>
+        <w:rPr>
+          <w:rFonts w:ascii="Arial" w:hAnsi="Arial" w:cs="Arial"/>
+          <w:sz w:val="24"/>
+          <w:szCs w:val="24"/>
+        </w:rPr>
+        <w:lastRenderedPageBreak/>
+        <w:t xml:space="preserve">The application was developed using Java, Java Servlets, </w:t>
+      </w:r>
+      <w:proofErr w:type="spellStart"/>
+      <w:r>
+        <w:rPr>
+          <w:rFonts w:ascii="Arial" w:hAnsi="Arial" w:cs="Arial"/>
+          <w:sz w:val="24"/>
+          <w:szCs w:val="24"/>
+        </w:rPr>
+        <w:t>JavaServer</w:t>
+      </w:r>
+      <w:proofErr w:type="spellEnd"/>
+      <w:r>
+        <w:rPr>
+          <w:rFonts w:ascii="Arial" w:hAnsi="Arial" w:cs="Arial"/>
+          <w:sz w:val="24"/>
+          <w:szCs w:val="24"/>
+        </w:rPr>
+        <w:t xml:space="preserve"> Pages (JSP), Apache Tomcat, and Maven. Although the application was working, it originally contained several logic errors that produced incorrect results. These bugs were found through automated testing and fixed during the project.</w:t>
+      </w:r>
+    </w:p>
+    <w:p>
+      <w:pPr>
+        <w:spacing w:line="360" w:lineRule="auto"/>
+        <w:jc w:val="both"/>
+        <w:rPr>
+          <w:rFonts w:ascii="Arial" w:hAnsi="Arial" w:cs="Arial"/>
+          <w:sz w:val="24"/>
+          <w:szCs w:val="24"/>
+        </w:rPr>
+      </w:pPr>
+    </w:p>
+    <w:p>
+      <w:pPr>
+        <w:spacing w:line="360" w:lineRule="auto"/>
+        <w:jc w:val="both"/>
+        <w:rPr>
+          <w:rFonts w:ascii="Arial" w:hAnsi="Arial" w:cs="Arial"/>
+          <w:b/>
+          <w:sz w:val="28"/>
+          <w:szCs w:val="28"/>
+        </w:rPr>
+      </w:pPr>
+      <w:r>
+        <w:rPr>
+          <w:rFonts w:ascii="Arial" w:hAnsi="Arial" w:cs="Arial"/>
+          <w:b/>
+          <w:sz w:val="28"/>
+          <w:szCs w:val="28"/>
+        </w:rPr>
+        <w:t xml:space="preserve">3. </w:t>
+      </w:r>
+      <w:r>
+        <w:rPr>
+          <w:rFonts w:ascii="Arial" w:hAnsi="Arial" w:cs="Arial"/>
+          <w:b/>
+          <w:sz w:val="28"/>
+          <w:szCs w:val="28"/>
+        </w:rPr>
+        <w:t>Objectives of the Project</w:t>
+      </w:r>
+    </w:p>
+    <w:p>
+      <w:pPr>
+        <w:spacing w:line="360" w:lineRule="auto"/>
+        <w:jc w:val="both"/>
+        <w:rPr>
+          <w:rFonts w:ascii="Arial" w:hAnsi="Arial" w:cs="Arial"/>
+          <w:b/>
+          <w:sz w:val="28"/>
+          <w:szCs w:val="28"/>
+        </w:rPr>
+      </w:pPr>
+    </w:p>
+    <w:p>
+      <w:pPr>
+        <w:spacing w:line="360" w:lineRule="auto"/>
+        <w:jc w:val="both"/>
+        <w:rPr>
+          <w:rFonts w:ascii="Arial" w:hAnsi="Arial" w:cs="Arial"/>
+          <w:sz w:val="24"/>
+          <w:szCs w:val="24"/>
+        </w:rPr>
+      </w:pPr>
+      <w:r>
+        <w:rPr>
+          <w:rFonts w:ascii="Arial" w:hAnsi="Arial" w:cs="Arial"/>
+          <w:sz w:val="24"/>
+          <w:szCs w:val="24"/>
+        </w:rPr>
+        <w:t>The main o</w:t>
+      </w:r>
+      <w:r>
+        <w:rPr>
+          <w:rFonts w:ascii="Arial" w:hAnsi="Arial" w:cs="Arial"/>
+          <w:sz w:val="24"/>
+          <w:szCs w:val="24"/>
+        </w:rPr>
+        <w:t>bjectives of this project were:</w:t>
+      </w:r>
+    </w:p>
+    <w:p>
+      <w:pPr>
+        <w:pStyle w:val="ListParagraph"/>
+        <w:numPr>
+          <w:ilvl w:val="0"/>
+          <w:numId w:val="2"/>
+        </w:numPr>
+        <w:spacing w:line="360" w:lineRule="auto"/>
+        <w:jc w:val="both"/>
+        <w:rPr>
+          <w:rFonts w:ascii="Arial" w:hAnsi="Arial" w:cs="Arial"/>
+          <w:sz w:val="24"/>
+          <w:szCs w:val="24"/>
+        </w:rPr>
+      </w:pPr>
+      <w:r>
+        <w:rPr>
+          <w:rFonts w:ascii="Arial" w:hAnsi="Arial" w:cs="Arial"/>
+          <w:sz w:val="24"/>
+          <w:szCs w:val="24"/>
+        </w:rPr>
+        <w:t>To build a full CI/CD pipeline</w:t>
+      </w:r>
+    </w:p>
+    <w:p>
+      <w:pPr>
+        <w:pStyle w:val="ListParagraph"/>
+        <w:numPr>
+          <w:ilvl w:val="0"/>
+          <w:numId w:val="2"/>
+        </w:numPr>
+        <w:spacing w:line="360" w:lineRule="auto"/>
+        <w:jc w:val="both"/>
+        <w:rPr>
+          <w:rFonts w:ascii="Arial" w:hAnsi="Arial" w:cs="Arial"/>
+          <w:sz w:val="24"/>
+          <w:szCs w:val="24"/>
+        </w:rPr>
+      </w:pPr>
+      <w:r>
+        <w:rPr>
+          <w:rFonts w:ascii="Arial" w:hAnsi="Arial" w:cs="Arial"/>
+          <w:sz w:val="24"/>
+          <w:szCs w:val="24"/>
+        </w:rPr>
+        <w:t>To automate testing and deployment of the application</w:t>
+      </w:r>
+    </w:p>
+    <w:p>
+      <w:pPr>
+        <w:pStyle w:val="ListParagraph"/>
+        <w:numPr>
+          <w:ilvl w:val="0"/>
+          <w:numId w:val="2"/>
+        </w:numPr>
+        <w:spacing w:line="360" w:lineRule="auto"/>
+        <w:jc w:val="both"/>
+        <w:rPr>
+          <w:rFonts w:ascii="Arial" w:hAnsi="Arial" w:cs="Arial"/>
+          <w:sz w:val="24"/>
+          <w:szCs w:val="24"/>
+        </w:rPr>
+      </w:pPr>
+      <w:r>
+        <w:rPr>
+          <w:rFonts w:ascii="Arial" w:hAnsi="Arial" w:cs="Arial"/>
+          <w:sz w:val="24"/>
+          <w:szCs w:val="24"/>
+        </w:rPr>
+        <w:t>To improve teamwork using GitHub</w:t>
+      </w:r>
+    </w:p>
+    <w:p>
+      <w:pPr>
+        <w:pStyle w:val="ListParagraph"/>
+        <w:numPr>
+          <w:ilvl w:val="0"/>
+          <w:numId w:val="2"/>
+        </w:numPr>
+        <w:spacing w:line="360" w:lineRule="auto"/>
+        <w:jc w:val="both"/>
+        <w:rPr>
+          <w:rFonts w:ascii="Arial" w:hAnsi="Arial" w:cs="Arial"/>
+          <w:sz w:val="24"/>
+          <w:szCs w:val="24"/>
+        </w:rPr>
+      </w:pPr>
+      <w:r>
+        <w:rPr>
+          <w:rFonts w:ascii="Arial" w:hAnsi="Arial" w:cs="Arial"/>
+          <w:sz w:val="24"/>
+          <w:szCs w:val="24"/>
+        </w:rPr>
+        <w:t>To find and fix bugs using unit tests</w:t>
+      </w:r>
+    </w:p>
+    <w:p>
+      <w:pPr>
+        <w:pStyle w:val="ListParagraph"/>
+        <w:numPr>
+          <w:ilvl w:val="0"/>
+          <w:numId w:val="2"/>
+        </w:numPr>
+        <w:spacing w:line="360" w:lineRule="auto"/>
+        <w:jc w:val="both"/>
+        <w:rPr>
+          <w:rFonts w:ascii="Arial" w:hAnsi="Arial" w:cs="Arial"/>
+          <w:sz w:val="24"/>
+          <w:szCs w:val="24"/>
+        </w:rPr>
+      </w:pPr>
+      <w:r>
+        <w:rPr>
+          <w:rFonts w:ascii="Arial" w:hAnsi="Arial" w:cs="Arial"/>
+          <w:sz w:val="24"/>
+          <w:szCs w:val="24"/>
+        </w:rPr>
+        <w:t>To package the application using Docker</w:t>
+      </w:r>
+    </w:p>
+    <w:p>
+      <w:pPr>
+        <w:pStyle w:val="ListParagraph"/>
+        <w:numPr>
+          <w:ilvl w:val="0"/>
+          <w:numId w:val="2"/>
+        </w:numPr>
+        <w:spacing w:line="360" w:lineRule="auto"/>
+        <w:jc w:val="both"/>
+        <w:rPr>
+          <w:rFonts w:ascii="Arial" w:hAnsi="Arial" w:cs="Arial"/>
+          <w:sz w:val="24"/>
+          <w:szCs w:val="24"/>
+        </w:rPr>
+      </w:pPr>
+      <w:r>
+        <w:rPr>
+          <w:rFonts w:ascii="Arial" w:hAnsi="Arial" w:cs="Arial"/>
+          <w:sz w:val="24"/>
+          <w:szCs w:val="24"/>
+        </w:rPr>
+        <w:t>To deploy the application to the cloud</w:t>
+      </w:r>
+    </w:p>
+    <w:p>
+      <w:pPr>
+        <w:pStyle w:val="ListParagraph"/>
+        <w:numPr>
+          <w:ilvl w:val="0"/>
+          <w:numId w:val="2"/>
+        </w:numPr>
+        <w:spacing w:line="360" w:lineRule="auto"/>
+        <w:jc w:val="both"/>
+        <w:rPr>
+          <w:rFonts w:ascii="Arial" w:hAnsi="Arial" w:cs="Arial"/>
+          <w:sz w:val="24"/>
+          <w:szCs w:val="24"/>
+        </w:rPr>
+      </w:pPr>
+      <w:r>
+        <w:rPr>
+          <w:rFonts w:ascii="Arial" w:hAnsi="Arial" w:cs="Arial"/>
+          <w:sz w:val="24"/>
+          <w:szCs w:val="24"/>
+        </w:rPr>
+        <w:t>To gain practical experience with DevOps tools and methods</w:t>
+      </w:r>
+    </w:p>
+    <w:p>
+      <w:pPr>
+        <w:spacing w:line="360" w:lineRule="auto"/>
+        <w:ind w:left="360"/>
+        <w:jc w:val="both"/>
+        <w:rPr>
+          <w:rFonts w:ascii="Arial" w:hAnsi="Arial" w:cs="Arial"/>
+          <w:sz w:val="24"/>
+          <w:szCs w:val="24"/>
+        </w:rPr>
+      </w:pPr>
+    </w:p>
+    <w:p>
+      <w:pPr>
+        <w:spacing w:line="360" w:lineRule="auto"/>
+        <w:jc w:val="both"/>
+        <w:rPr>
+          <w:rFonts w:ascii="Arial" w:hAnsi="Arial" w:cs="Arial"/>
+          <w:b/>
+          <w:sz w:val="28"/>
+          <w:szCs w:val="28"/>
+        </w:rPr>
+      </w:pPr>
+      <w:r>
+        <w:rPr>
+          <w:rFonts w:ascii="Arial" w:hAnsi="Arial" w:cs="Arial"/>
+          <w:b/>
+          <w:sz w:val="28"/>
+          <w:szCs w:val="28"/>
+        </w:rPr>
+        <w:t>4. Version Control and Collaboration</w:t>
+      </w:r>
+    </w:p>
+    <w:p>
+      <w:pPr>
+        <w:spacing w:line="360" w:lineRule="auto"/>
+        <w:jc w:val="both"/>
+        <w:rPr>
+          <w:rFonts w:ascii="Arial" w:hAnsi="Arial" w:cs="Arial"/>
+          <w:sz w:val="24"/>
+          <w:szCs w:val="24"/>
+        </w:rPr>
+      </w:pPr>
+    </w:p>
+    <w:p>
+      <w:pPr>
+        <w:spacing w:line="360" w:lineRule="auto"/>
+        <w:jc w:val="both"/>
+        <w:rPr>
+          <w:rFonts w:ascii="Arial" w:hAnsi="Arial" w:cs="Arial"/>
+          <w:sz w:val="24"/>
+          <w:szCs w:val="24"/>
+        </w:rPr>
+      </w:pPr>
+      <w:r>
+        <w:rPr>
+          <w:rFonts w:ascii="Arial" w:hAnsi="Arial" w:cs="Arial"/>
+          <w:sz w:val="24"/>
+          <w:szCs w:val="24"/>
+        </w:rPr>
+        <w:t>GitHub was used to manage the project code. The group leader created the repository and added all members. Each member copied the project to their own computer and worked on a separate feature branch. This allowed everyone to work on their tasks without changing the main code.</w:t>
+      </w:r>
+    </w:p>
+    <w:p>
+      <w:pPr>
+        <w:spacing w:line="360" w:lineRule="auto"/>
+        <w:jc w:val="both"/>
+        <w:rPr>
+          <w:rFonts w:ascii="Arial" w:hAnsi="Arial" w:cs="Arial"/>
+          <w:sz w:val="24"/>
+          <w:szCs w:val="24"/>
+        </w:rPr>
+      </w:pPr>
+    </w:p>
+    <w:p>
+      <w:pPr>
+        <w:spacing w:line="360" w:lineRule="auto"/>
+        <w:jc w:val="both"/>
+        <w:rPr>
+          <w:rFonts w:ascii="Arial" w:hAnsi="Arial" w:cs="Arial"/>
+          <w:sz w:val="24"/>
+          <w:szCs w:val="24"/>
+        </w:rPr>
+      </w:pPr>
+    </w:p>
+    <w:p>
+      <w:pPr>
+        <w:spacing w:line="360" w:lineRule="auto"/>
+        <w:jc w:val="both"/>
+        <w:rPr>
+          <w:rFonts w:ascii="Arial" w:hAnsi="Arial" w:cs="Arial"/>
+          <w:sz w:val="24"/>
+          <w:szCs w:val="24"/>
+        </w:rPr>
+      </w:pPr>
+    </w:p>
+    <w:p>
+      <w:pPr>
+        <w:spacing w:line="360" w:lineRule="auto"/>
+        <w:jc w:val="both"/>
+        <w:rPr>
+          <w:rFonts w:ascii="Arial" w:hAnsi="Arial" w:cs="Arial"/>
+          <w:sz w:val="24"/>
+          <w:szCs w:val="24"/>
+        </w:rPr>
+      </w:pPr>
+      <w:r>
+        <w:rPr>
+          <w:rFonts w:ascii="Arial" w:hAnsi="Arial" w:cs="Arial"/>
+          <w:sz w:val="24"/>
+          <w:szCs w:val="24"/>
+        </w:rPr>
+        <w:lastRenderedPageBreak/>
+        <w:t>The following branches were created:</w:t>
+      </w:r>
+    </w:p>
+    <w:p>
+      <w:pPr>
+        <w:spacing w:line="360" w:lineRule="auto"/>
+        <w:jc w:val="both"/>
+        <w:rPr>
+          <w:rFonts w:ascii="Arial" w:hAnsi="Arial" w:cs="Arial"/>
+          <w:sz w:val="24"/>
+          <w:szCs w:val="24"/>
+        </w:rPr>
+      </w:pPr>
+    </w:p>
+    <w:tbl>
+      <w:tblPr>
+        <w:tblStyle w:val="TableGrid"/>
+        <w:tblW w:w="0" w:type="auto"/>
+        <w:tblInd w:w="1351" w:type="dxa"/>
+        <w:tblLook w:val="04A0" w:firstRow="1" w:lastRow="0" w:firstColumn="1" w:lastColumn="0" w:noHBand="0" w:noVBand="1"/>
+      </w:tblPr>
+      <w:tblGrid>
+        <w:gridCol w:w="3332"/>
+        <w:gridCol w:w="4187"/>
+      </w:tblGrid>
+      <w:tr>
+        <w:trPr>
+          <w:trHeight w:val="387"/>
+        </w:trPr>
+        <w:tc>
+          <w:tcPr>
+            <w:tcW w:w="3332" w:type="dxa"/>
+          </w:tcPr>
+          <w:p>
+            <w:pPr>
+              <w:spacing w:line="360" w:lineRule="auto"/>
+              <w:jc w:val="both"/>
+              <w:rPr>
+                <w:rFonts w:ascii="Arial" w:hAnsi="Arial" w:cs="Arial"/>
+                <w:b/>
+                <w:sz w:val="24"/>
+                <w:szCs w:val="24"/>
+              </w:rPr>
+            </w:pPr>
+            <w:r>
+              <w:rPr>
+                <w:rFonts w:ascii="Arial" w:hAnsi="Arial" w:cs="Arial"/>
+                <w:b/>
+                <w:sz w:val="24"/>
+                <w:szCs w:val="24"/>
+              </w:rPr>
+              <w:t>Team Role</w:t>
+            </w:r>
+          </w:p>
+        </w:tc>
+        <w:tc>
+          <w:tcPr>
+            <w:tcW w:w="4187" w:type="dxa"/>
+          </w:tcPr>
+          <w:p>
+            <w:pPr>
+              <w:spacing w:line="360" w:lineRule="auto"/>
+              <w:jc w:val="both"/>
+              <w:rPr>
+                <w:rFonts w:ascii="Arial" w:hAnsi="Arial" w:cs="Arial"/>
+                <w:b/>
+                <w:sz w:val="24"/>
+                <w:szCs w:val="24"/>
+              </w:rPr>
+            </w:pPr>
+            <w:r>
+              <w:rPr>
+                <w:rFonts w:ascii="Arial" w:hAnsi="Arial" w:cs="Arial"/>
+                <w:b/>
+                <w:sz w:val="24"/>
+                <w:szCs w:val="24"/>
+              </w:rPr>
+              <w:t>Branch Name</w:t>
+            </w:r>
+          </w:p>
+        </w:tc>
+      </w:tr>
+      <w:tr>
+        <w:trPr>
+          <w:trHeight w:val="366"/>
+        </w:trPr>
+        <w:tc>
+          <w:tcPr>
+            <w:tcW w:w="3332" w:type="dxa"/>
+          </w:tcPr>
+          <w:p>
+            <w:pPr>
+              <w:spacing w:line="360" w:lineRule="auto"/>
+              <w:jc w:val="both"/>
+              <w:rPr>
+                <w:rFonts w:ascii="Arial" w:hAnsi="Arial" w:cs="Arial"/>
+                <w:sz w:val="24"/>
+                <w:szCs w:val="24"/>
+              </w:rPr>
+            </w:pPr>
+            <w:r>
+              <w:rPr>
+                <w:rFonts w:ascii="Arial" w:hAnsi="Arial" w:cs="Arial"/>
+                <w:sz w:val="24"/>
+                <w:szCs w:val="24"/>
+              </w:rPr>
+              <w:t>Documentation</w:t>
+            </w:r>
+          </w:p>
+        </w:tc>
+        <w:tc>
+          <w:tcPr>
+            <w:tcW w:w="4187" w:type="dxa"/>
+          </w:tcPr>
+          <w:p>
+            <w:pPr>
+              <w:spacing w:line="360" w:lineRule="auto"/>
+              <w:jc w:val="both"/>
+              <w:rPr>
+                <w:rFonts w:ascii="Arial" w:hAnsi="Arial" w:cs="Arial"/>
+                <w:sz w:val="24"/>
+                <w:szCs w:val="24"/>
+              </w:rPr>
+            </w:pPr>
+            <w:r>
+              <w:rPr>
+                <w:rFonts w:ascii="Arial" w:hAnsi="Arial" w:cs="Arial"/>
+                <w:sz w:val="24"/>
+                <w:szCs w:val="24"/>
+              </w:rPr>
+              <w:t>feature/documentation</w:t>
+            </w:r>
+          </w:p>
+        </w:tc>
+      </w:tr>
+      <w:tr>
+        <w:trPr>
+          <w:trHeight w:val="387"/>
+        </w:trPr>
+        <w:tc>
+          <w:tcPr>
+            <w:tcW w:w="3332" w:type="dxa"/>
+          </w:tcPr>
+          <w:p>
+            <w:pPr>
+              <w:spacing w:line="360" w:lineRule="auto"/>
+              <w:jc w:val="both"/>
+              <w:rPr>
+                <w:rFonts w:ascii="Arial" w:hAnsi="Arial" w:cs="Arial"/>
+                <w:sz w:val="24"/>
+                <w:szCs w:val="24"/>
+              </w:rPr>
+            </w:pPr>
+            <w:r>
+              <w:rPr>
+                <w:rFonts w:ascii="Arial" w:hAnsi="Arial" w:cs="Arial"/>
+                <w:sz w:val="24"/>
+                <w:szCs w:val="24"/>
+              </w:rPr>
+              <w:t>QA/Testing</w:t>
+            </w:r>
+          </w:p>
+        </w:tc>
+        <w:tc>
+          <w:tcPr>
+            <w:tcW w:w="4187" w:type="dxa"/>
+          </w:tcPr>
+          <w:p>
+            <w:pPr>
+              <w:spacing w:line="360" w:lineRule="auto"/>
+              <w:jc w:val="both"/>
+              <w:rPr>
+                <w:rFonts w:ascii="Arial" w:hAnsi="Arial" w:cs="Arial"/>
+                <w:sz w:val="24"/>
+                <w:szCs w:val="24"/>
+              </w:rPr>
+            </w:pPr>
+            <w:r>
+              <w:rPr>
+                <w:rFonts w:ascii="Arial" w:hAnsi="Arial" w:cs="Arial"/>
+                <w:sz w:val="24"/>
+                <w:szCs w:val="24"/>
+              </w:rPr>
+              <w:t>feature/testing</w:t>
+            </w:r>
+          </w:p>
+        </w:tc>
+      </w:tr>
+      <w:tr>
+        <w:trPr>
+          <w:trHeight w:val="387"/>
+        </w:trPr>
+        <w:tc>
+          <w:tcPr>
+            <w:tcW w:w="3332" w:type="dxa"/>
+          </w:tcPr>
+          <w:p>
+            <w:pPr>
+              <w:spacing w:line="360" w:lineRule="auto"/>
+              <w:jc w:val="both"/>
+              <w:rPr>
+                <w:rFonts w:ascii="Arial" w:hAnsi="Arial" w:cs="Arial"/>
+                <w:sz w:val="24"/>
+                <w:szCs w:val="24"/>
+              </w:rPr>
+            </w:pPr>
+            <w:r>
+              <w:rPr>
+                <w:rFonts w:ascii="Arial" w:hAnsi="Arial" w:cs="Arial"/>
+                <w:sz w:val="24"/>
+                <w:szCs w:val="24"/>
+              </w:rPr>
+              <w:t>Bug Fixing</w:t>
+            </w:r>
+          </w:p>
+        </w:tc>
+        <w:tc>
+          <w:tcPr>
+            <w:tcW w:w="4187" w:type="dxa"/>
+          </w:tcPr>
+          <w:p>
+            <w:pPr>
+              <w:spacing w:line="360" w:lineRule="auto"/>
+              <w:jc w:val="both"/>
+              <w:rPr>
+                <w:rFonts w:ascii="Arial" w:hAnsi="Arial" w:cs="Arial"/>
+                <w:sz w:val="24"/>
+                <w:szCs w:val="24"/>
+              </w:rPr>
+            </w:pPr>
+            <w:r>
+              <w:rPr>
+                <w:rFonts w:ascii="Arial" w:hAnsi="Arial" w:cs="Arial"/>
+                <w:sz w:val="24"/>
+                <w:szCs w:val="24"/>
+              </w:rPr>
+              <w:t>feature/bug-fixes</w:t>
+            </w:r>
+          </w:p>
+        </w:tc>
+      </w:tr>
+      <w:tr>
+        <w:trPr>
+          <w:trHeight w:val="366"/>
+        </w:trPr>
+        <w:tc>
+          <w:tcPr>
+            <w:tcW w:w="3332" w:type="dxa"/>
+          </w:tcPr>
+          <w:p>
+            <w:pPr>
+              <w:spacing w:line="360" w:lineRule="auto"/>
+              <w:jc w:val="both"/>
+              <w:rPr>
+                <w:rFonts w:ascii="Arial" w:hAnsi="Arial" w:cs="Arial"/>
+                <w:sz w:val="24"/>
+                <w:szCs w:val="24"/>
+              </w:rPr>
+            </w:pPr>
+            <w:r>
+              <w:rPr>
+                <w:rFonts w:ascii="Arial" w:hAnsi="Arial" w:cs="Arial"/>
+                <w:sz w:val="24"/>
+                <w:szCs w:val="24"/>
+              </w:rPr>
+              <w:t>CI Pipeline</w:t>
+            </w:r>
+          </w:p>
+        </w:tc>
+        <w:tc>
+          <w:tcPr>
+            <w:tcW w:w="4187" w:type="dxa"/>
+          </w:tcPr>
+          <w:p>
+            <w:pPr>
+              <w:spacing w:line="360" w:lineRule="auto"/>
+              <w:jc w:val="both"/>
+              <w:rPr>
+                <w:rFonts w:ascii="Arial" w:hAnsi="Arial" w:cs="Arial"/>
+                <w:sz w:val="24"/>
+                <w:szCs w:val="24"/>
+              </w:rPr>
+            </w:pPr>
+            <w:r>
+              <w:rPr>
+                <w:rFonts w:ascii="Arial" w:hAnsi="Arial" w:cs="Arial"/>
+                <w:sz w:val="24"/>
+                <w:szCs w:val="24"/>
+              </w:rPr>
+              <w:t>Feature/ci-pipeline</w:t>
+            </w:r>
+          </w:p>
+        </w:tc>
+      </w:tr>
+      <w:tr>
+        <w:trPr>
+          <w:trHeight w:val="387"/>
+        </w:trPr>
+        <w:tc>
+          <w:tcPr>
+            <w:tcW w:w="3332" w:type="dxa"/>
+          </w:tcPr>
+          <w:p>
+            <w:pPr>
+              <w:spacing w:line="360" w:lineRule="auto"/>
+              <w:jc w:val="both"/>
+              <w:rPr>
+                <w:rFonts w:ascii="Arial" w:hAnsi="Arial" w:cs="Arial"/>
+                <w:sz w:val="24"/>
+                <w:szCs w:val="24"/>
+              </w:rPr>
+            </w:pPr>
+            <w:r>
+              <w:rPr>
+                <w:rFonts w:ascii="Arial" w:hAnsi="Arial" w:cs="Arial"/>
+                <w:sz w:val="24"/>
+                <w:szCs w:val="24"/>
+              </w:rPr>
+              <w:t>Docker and Deployment</w:t>
+            </w:r>
+          </w:p>
+        </w:tc>
+        <w:tc>
+          <w:tcPr>
+            <w:tcW w:w="4187" w:type="dxa"/>
+          </w:tcPr>
+          <w:p>
+            <w:pPr>
+              <w:spacing w:line="360" w:lineRule="auto"/>
+              <w:jc w:val="both"/>
+              <w:rPr>
+                <w:rFonts w:ascii="Arial" w:hAnsi="Arial" w:cs="Arial"/>
+                <w:sz w:val="24"/>
+                <w:szCs w:val="24"/>
+              </w:rPr>
+            </w:pPr>
+            <w:r>
+              <w:rPr>
+                <w:rFonts w:ascii="Arial" w:hAnsi="Arial" w:cs="Arial"/>
+                <w:sz w:val="24"/>
+                <w:szCs w:val="24"/>
+              </w:rPr>
+              <w:t>feature/</w:t>
+            </w:r>
+            <w:proofErr w:type="spellStart"/>
+            <w:r>
+              <w:rPr>
+                <w:rFonts w:ascii="Arial" w:hAnsi="Arial" w:cs="Arial"/>
+                <w:sz w:val="24"/>
+                <w:szCs w:val="24"/>
+              </w:rPr>
+              <w:t>docker</w:t>
+            </w:r>
+            <w:proofErr w:type="spellEnd"/>
+            <w:r>
+              <w:rPr>
+                <w:rFonts w:ascii="Arial" w:hAnsi="Arial" w:cs="Arial"/>
+                <w:sz w:val="24"/>
+                <w:szCs w:val="24"/>
+              </w:rPr>
+              <w:t>-deploy</w:t>
+            </w:r>
+          </w:p>
+        </w:tc>
+      </w:tr>
+    </w:tbl>
+    <w:p>
+      <w:pPr>
+        <w:spacing w:line="360" w:lineRule="auto"/>
+        <w:jc w:val="both"/>
+        <w:rPr>
+          <w:rFonts w:ascii="Arial" w:hAnsi="Arial" w:cs="Arial"/>
+          <w:sz w:val="24"/>
+          <w:szCs w:val="24"/>
+        </w:rPr>
+      </w:pPr>
+    </w:p>
+    <w:p>
+      <w:pPr>
+        <w:spacing w:line="360" w:lineRule="auto"/>
+        <w:jc w:val="both"/>
+        <w:rPr>
+          <w:rFonts w:ascii="Arial" w:hAnsi="Arial" w:cs="Arial"/>
+          <w:b/>
+          <w:sz w:val="28"/>
+          <w:szCs w:val="28"/>
+        </w:rPr>
+      </w:pPr>
+      <w:r>
+        <w:rPr>
+          <w:rFonts w:ascii="Arial" w:hAnsi="Arial" w:cs="Arial"/>
+          <w:b/>
+          <w:sz w:val="28"/>
+          <w:szCs w:val="28"/>
+        </w:rPr>
+        <w:t>Screenshots</w:t>
+      </w:r>
+    </w:p>
+    <w:p>
+      <w:pPr>
+        <w:spacing w:line="360" w:lineRule="auto"/>
+        <w:jc w:val="both"/>
+        <w:rPr>
+          <w:rFonts w:ascii="Arial" w:hAnsi="Arial" w:cs="Arial"/>
+          <w:b/>
+          <w:sz w:val="28"/>
+          <w:szCs w:val="28"/>
+        </w:rPr>
+      </w:pPr>
+      <w:r>
+        <w:rPr>
+          <w:rFonts w:ascii="Arial" w:hAnsi="Arial" w:cs="Arial"/>
+          <w:b/>
+          <w:sz w:val="28"/>
+          <w:szCs w:val="28"/>
+        </w:rPr>
+        <w:t>4.1 GitHub Repository</w:t>
+      </w:r>
+    </w:p>
+    <w:p>
+      <w:pPr>
+        <w:spacing w:line="360" w:lineRule="auto"/>
+        <w:jc w:val="both"/>
+        <w:rPr>
+          <w:rFonts w:ascii="Arial" w:hAnsi="Arial" w:cs="Arial"/>
+          <w:b/>
+          <w:sz w:val="28"/>
+          <w:szCs w:val="28"/>
+        </w:rPr>
+      </w:pPr>
+      <w:r>
+        <w:rPr>
+          <w:rFonts w:ascii="Arial" w:hAnsi="Arial" w:cs="Arial"/>
+          <w:b/>
+          <w:noProof/>
+          <w:sz w:val="28"/>
+          <w:szCs w:val="28"/>
+          <w:lang w:eastAsia="en-ZA"/>
+          <w14:ligatures w14:val="none"/>
+        </w:rPr>
+        <w:drawing>
+          <wp:inline distT="0" distB="0" distL="0" distR="0">
+            <wp:extent cx="6400800" cy="3162300"/>
+            <wp:effectExtent l="209550" t="209550" r="209550" b="209550"/>
+            <wp:docPr id="1" name="Picture 1"/>
+            <wp:cNvGraphicFramePr>
+              <a:graphicFrameLocks xmlns:a="http://schemas.openxmlformats.org/drawingml/2006/main" noChangeAspect="1"/>
+            </wp:cNvGraphicFramePr>
+            <a:graphic xmlns:a="http://schemas.openxmlformats.org/drawingml/2006/main">
+              <a:graphicData uri="http://schemas.openxmlformats.org/drawingml/2006/picture">
+                <pic:pic xmlns:pic="http://schemas.openxmlformats.org/drawingml/2006/picture">
+                  <pic:nvPicPr>
+                    <pic:cNvPr id="1" name="Screenshot 2026-05-15 081943.png"/>
+                    <pic:cNvPicPr/>
+                  </pic:nvPicPr>
+                  <pic:blipFill>
+                    <a:blip r:embed="rId10" cstate="print">
+                      <a:extLst>
+                        <a:ext uri="{28A0092B-C50C-407E-A947-70E740481C1C}">
+                          <a14:useLocalDpi xmlns:a14="http://schemas.microsoft.com/office/drawing/2010/main" val="0"/>
+                        </a:ext>
+                      </a:extLst>
+                    </a:blip>
+                    <a:stretch>
+                      <a:fillRect/>
+                    </a:stretch>
+                  </pic:blipFill>
+                  <pic:spPr>
+                    <a:xfrm>
+                      <a:off x="0" y="0"/>
+                      <a:ext cx="6421853" cy="3172701"/>
+                    </a:xfrm>
+                    <a:prstGeom prst="rect">
+                      <a:avLst/>
+                    </a:prstGeom>
+                    <a:ln>
+                      <a:solidFill>
+                        <a:schemeClr val="accent1">
+                          <a:lumMod val="40000"/>
+                          <a:lumOff val="60000"/>
+                        </a:schemeClr>
+                      </a:solidFill>
+                    </a:ln>
+                    <a:effectLst>
+                      <a:outerShdw blurRad="190500" algn="tl" rotWithShape="0">
+                        <a:srgbClr val="000000">
+                          <a:alpha val="70000"/>
+                        </a:srgbClr>
+                      </a:outerShdw>
+                    </a:effectLst>
+                  </pic:spPr>
+                </pic:pic>
+              </a:graphicData>
+            </a:graphic>
+          </wp:inline>
+        </w:drawing>
+      </w:r>
+    </w:p>
+    <w:p>
+      <w:pPr>
+        <w:spacing w:line="360" w:lineRule="auto"/>
+        <w:jc w:val="both"/>
+        <w:rPr>
+          <w:rFonts w:ascii="Arial" w:hAnsi="Arial" w:cs="Arial"/>
+          <w:b/>
+          <w:sz w:val="28"/>
+          <w:szCs w:val="28"/>
+        </w:rPr>
+      </w:pPr>
+    </w:p>
+    <w:p>
+      <w:pPr>
+        <w:spacing w:line="360" w:lineRule="auto"/>
+        <w:jc w:val="both"/>
+        <w:rPr>
+          <w:rFonts w:ascii="Arial" w:hAnsi="Arial" w:cs="Arial"/>
+          <w:b/>
+          <w:sz w:val="28"/>
+          <w:szCs w:val="28"/>
+        </w:rPr>
+      </w:pPr>
+    </w:p>
+    <w:p>
+      <w:pPr>
+        <w:spacing w:line="360" w:lineRule="auto"/>
+        <w:jc w:val="both"/>
+        <w:rPr>
+          <w:rFonts w:ascii="Arial" w:hAnsi="Arial" w:cs="Arial"/>
+          <w:b/>
+          <w:sz w:val="28"/>
+          <w:szCs w:val="28"/>
+        </w:rPr>
+      </w:pPr>
+      <w:r>
+        <w:rPr>
+          <w:rFonts w:ascii="Arial" w:hAnsi="Arial" w:cs="Arial"/>
+          <w:b/>
+          <w:sz w:val="28"/>
+          <w:szCs w:val="28"/>
+        </w:rPr>
+        <w:lastRenderedPageBreak/>
+        <w:t xml:space="preserve">4.2 </w:t>
+      </w:r>
+      <w:r>
+        <w:rPr>
+          <w:rFonts w:ascii="Arial" w:hAnsi="Arial" w:cs="Arial"/>
+          <w:b/>
+          <w:sz w:val="28"/>
+          <w:szCs w:val="28"/>
+        </w:rPr>
+        <w:t>Feature Branches</w:t>
+      </w:r>
+    </w:p>
+    <w:p>
+      <w:pPr>
+        <w:spacing w:line="360" w:lineRule="auto"/>
+        <w:jc w:val="both"/>
+        <w:rPr>
+          <w:rFonts w:ascii="Arial" w:hAnsi="Arial" w:cs="Arial"/>
+          <w:b/>
+          <w:sz w:val="28"/>
+          <w:szCs w:val="28"/>
+        </w:rPr>
+      </w:pPr>
+      <w:r>
+        <w:rPr>
+          <w:rFonts w:ascii="Arial" w:hAnsi="Arial" w:cs="Arial"/>
+          <w:b/>
+          <w:noProof/>
+          <w:sz w:val="28"/>
+          <w:szCs w:val="28"/>
+          <w:lang w:eastAsia="en-ZA"/>
+          <w14:ligatures w14:val="none"/>
+        </w:rPr>
+        <w:drawing>
+          <wp:inline distT="0" distB="0" distL="0" distR="0">
+            <wp:extent cx="2797629" cy="3385848"/>
+            <wp:effectExtent l="152400" t="152400" r="365125" b="367030"/>
+            <wp:docPr id="5" name="Picture 5"/>
+            <wp:cNvGraphicFramePr>
+              <a:graphicFrameLocks xmlns:a="http://schemas.openxmlformats.org/drawingml/2006/main" noChangeAspect="1"/>
+            </wp:cNvGraphicFramePr>
+            <a:graphic xmlns:a="http://schemas.openxmlformats.org/drawingml/2006/main">
+              <a:graphicData uri="http://schemas.openxmlformats.org/drawingml/2006/picture">
+                <pic:pic xmlns:pic="http://schemas.openxmlformats.org/drawingml/2006/picture">
+                  <pic:nvPicPr>
+                    <pic:cNvPr id="5" name="Screenshot 2026-05-17 211559.png"/>
+                    <pic:cNvPicPr/>
+                  </pic:nvPicPr>
+                  <pic:blipFill>
+                    <a:blip r:embed="rId11">
+                      <a:extLst>
+                        <a:ext uri="{28A0092B-C50C-407E-A947-70E740481C1C}">
+                          <a14:useLocalDpi xmlns:a14="http://schemas.microsoft.com/office/drawing/2010/main" val="0"/>
+                        </a:ext>
+                      </a:extLst>
+                    </a:blip>
+                    <a:stretch>
+                      <a:fillRect/>
+                    </a:stretch>
+                  </pic:blipFill>
+                  <pic:spPr>
+                    <a:xfrm>
+                      <a:off x="0" y="0"/>
+                      <a:ext cx="2803326" cy="3392743"/>
+                    </a:xfrm>
+                    <a:prstGeom prst="rect">
+                      <a:avLst/>
+                    </a:prstGeom>
+                    <a:ln>
+                      <a:noFill/>
+                    </a:ln>
+                    <a:effectLst>
+                      <a:outerShdw blurRad="292100" dist="139700" dir="2700000" algn="tl" rotWithShape="0">
+                        <a:srgbClr val="333333">
+                          <a:alpha val="65000"/>
+                        </a:srgbClr>
+                      </a:outerShdw>
+                    </a:effectLst>
+                  </pic:spPr>
+                </pic:pic>
+              </a:graphicData>
+            </a:graphic>
+          </wp:inline>
+        </w:drawing>
+      </w:r>
+    </w:p>
+    <w:p>
+      <w:pPr>
+        <w:spacing w:line="360" w:lineRule="auto"/>
+        <w:jc w:val="both"/>
+        <w:rPr>
+          <w:rFonts w:ascii="Arial" w:hAnsi="Arial" w:cs="Arial"/>
+          <w:b/>
+          <w:sz w:val="28"/>
+          <w:szCs w:val="28"/>
+        </w:rPr>
+      </w:pPr>
+      <w:r>
+        <w:rPr>
+          <w:rFonts w:ascii="Arial" w:hAnsi="Arial" w:cs="Arial"/>
+          <w:b/>
+          <w:sz w:val="28"/>
+          <w:szCs w:val="28"/>
+        </w:rPr>
+        <w:t>4.3 Pull Request</w:t>
+      </w:r>
+      <w:r>
+        <w:rPr>
+          <w:rFonts w:ascii="Arial" w:hAnsi="Arial" w:cs="Arial"/>
+          <w:b/>
+          <w:sz w:val="28"/>
+          <w:szCs w:val="28"/>
+        </w:rPr>
+        <w:t>s</w:t>
+      </w:r>
+    </w:p>
+    <w:p>
+      <w:pPr>
+        <w:spacing w:line="360" w:lineRule="auto"/>
+        <w:jc w:val="both"/>
+        <w:rPr>
+          <w:rFonts w:ascii="Arial" w:hAnsi="Arial" w:cs="Arial"/>
+          <w:b/>
+          <w:sz w:val="28"/>
+          <w:szCs w:val="28"/>
+        </w:rPr>
+      </w:pPr>
+      <w:r>
+        <w:rPr>
+          <w:rFonts w:ascii="Arial" w:hAnsi="Arial" w:cs="Arial"/>
+          <w:b/>
+          <w:noProof/>
+          <w:sz w:val="28"/>
+          <w:szCs w:val="28"/>
+          <w:lang w:eastAsia="en-ZA"/>
+          <w14:ligatures w14:val="none"/>
+        </w:rPr>
+        <w:drawing>
+          <wp:inline distT="0" distB="0" distL="0" distR="0">
+            <wp:extent cx="5950527" cy="1830544"/>
+            <wp:effectExtent l="190500" t="190500" r="184150" b="189230"/>
+            <wp:docPr id="4" name="Picture 4"/>
+            <wp:cNvGraphicFramePr>
+              <a:graphicFrameLocks xmlns:a="http://schemas.openxmlformats.org/drawingml/2006/main" noChangeAspect="1"/>
+            </wp:cNvGraphicFramePr>
+            <a:graphic xmlns:a="http://schemas.openxmlformats.org/drawingml/2006/main">
+              <a:graphicData uri="http://schemas.openxmlformats.org/drawingml/2006/picture">
+                <pic:pic xmlns:pic="http://schemas.openxmlformats.org/drawingml/2006/picture">
+                  <pic:nvPicPr>
+                    <pic:cNvPr id="4" name="Screenshot 2026-05-15 083012.png"/>
+                    <pic:cNvPicPr/>
+                  </pic:nvPicPr>
+                  <pic:blipFill>
+                    <a:blip r:embed="rId12">
+                      <a:extLst>
+                        <a:ext uri="{28A0092B-C50C-407E-A947-70E740481C1C}">
+                          <a14:useLocalDpi xmlns:a14="http://schemas.microsoft.com/office/drawing/2010/main" val="0"/>
+                        </a:ext>
+                      </a:extLst>
+                    </a:blip>
+                    <a:stretch>
+                      <a:fillRect/>
+                    </a:stretch>
+                  </pic:blipFill>
+                  <pic:spPr>
+                    <a:xfrm>
+                      <a:off x="0" y="0"/>
+                      <a:ext cx="6136059" cy="1887619"/>
+                    </a:xfrm>
+                    <a:prstGeom prst="rect">
+                      <a:avLst/>
+                    </a:prstGeom>
+                    <a:ln>
+                      <a:noFill/>
+                    </a:ln>
+                    <a:effectLst>
+                      <a:outerShdw blurRad="190500" algn="tl" rotWithShape="0">
+                        <a:srgbClr val="000000">
+                          <a:alpha val="70000"/>
+                        </a:srgbClr>
+                      </a:outerShdw>
+                    </a:effectLst>
+                  </pic:spPr>
+                </pic:pic>
+              </a:graphicData>
+            </a:graphic>
+          </wp:inline>
+        </w:drawing>
+      </w:r>
+    </w:p>
+    <w:p>
+      <w:pPr>
+        <w:spacing w:line="360" w:lineRule="auto"/>
+        <w:jc w:val="both"/>
+        <w:rPr>
+          <w:rFonts w:ascii="Arial" w:hAnsi="Arial" w:cs="Arial"/>
+          <w:b/>
+          <w:sz w:val="28"/>
+          <w:szCs w:val="28"/>
+        </w:rPr>
+      </w:pPr>
+    </w:p>
+    <w:p>
+      <w:pPr>
+        <w:spacing w:line="360" w:lineRule="auto"/>
+        <w:jc w:val="both"/>
+        <w:rPr>
+          <w:rFonts w:ascii="Arial" w:hAnsi="Arial" w:cs="Arial"/>
+          <w:b/>
+          <w:sz w:val="28"/>
+          <w:szCs w:val="28"/>
+        </w:rPr>
+      </w:pPr>
+    </w:p>
+    <w:p>
+      <w:pPr>
+        <w:spacing w:line="360" w:lineRule="auto"/>
+        <w:jc w:val="both"/>
+        <w:rPr>
+          <w:rFonts w:ascii="Arial" w:hAnsi="Arial" w:cs="Arial"/>
+          <w:b/>
+          <w:sz w:val="28"/>
+          <w:szCs w:val="28"/>
+        </w:rPr>
+      </w:pPr>
+      <w:r>
+        <w:rPr>
+          <w:rFonts w:ascii="Arial" w:hAnsi="Arial" w:cs="Arial"/>
+          <w:b/>
+          <w:sz w:val="28"/>
+          <w:szCs w:val="28"/>
+        </w:rPr>
+        <w:lastRenderedPageBreak/>
+        <w:t>5. Build and Testing Process</w:t>
+      </w:r>
+    </w:p>
+    <w:p>
+      <w:pPr>
+        <w:spacing w:line="360" w:lineRule="auto"/>
+        <w:jc w:val="both"/>
+        <w:rPr>
+          <w:rFonts w:ascii="Arial" w:hAnsi="Arial" w:cs="Arial"/>
+          <w:b/>
+          <w:sz w:val="28"/>
+          <w:szCs w:val="28"/>
+        </w:rPr>
+      </w:pPr>
+    </w:p>
+    <w:p>
+      <w:pPr>
+        <w:spacing w:line="360" w:lineRule="auto"/>
+        <w:jc w:val="both"/>
+        <w:rPr>
+          <w:rFonts w:ascii="Arial" w:hAnsi="Arial" w:cs="Arial"/>
+          <w:sz w:val="24"/>
+          <w:szCs w:val="24"/>
+        </w:rPr>
+      </w:pPr>
+      <w:r>
+        <w:rPr>
+          <w:rFonts w:ascii="Arial" w:hAnsi="Arial" w:cs="Arial"/>
+          <w:sz w:val="24"/>
+          <w:szCs w:val="24"/>
+        </w:rPr>
+        <w:t xml:space="preserve">Maven was used as the build tool for the project. We ran the commands </w:t>
+      </w:r>
+      <w:proofErr w:type="spellStart"/>
+      <w:r>
+        <w:rPr>
+          <w:rFonts w:ascii="Arial" w:hAnsi="Arial" w:cs="Arial"/>
+          <w:b/>
+          <w:sz w:val="24"/>
+          <w:szCs w:val="24"/>
+        </w:rPr>
+        <w:t>mvn</w:t>
+      </w:r>
+      <w:proofErr w:type="spellEnd"/>
+      <w:r>
+        <w:rPr>
+          <w:rFonts w:ascii="Arial" w:hAnsi="Arial" w:cs="Arial"/>
+          <w:b/>
+          <w:sz w:val="24"/>
+          <w:szCs w:val="24"/>
+        </w:rPr>
+        <w:t xml:space="preserve"> clean package</w:t>
+      </w:r>
+      <w:r>
+        <w:rPr>
+          <w:rFonts w:ascii="Arial" w:hAnsi="Arial" w:cs="Arial"/>
+          <w:sz w:val="24"/>
+          <w:szCs w:val="24"/>
+        </w:rPr>
+        <w:t xml:space="preserve"> and </w:t>
+      </w:r>
+      <w:proofErr w:type="spellStart"/>
+      <w:r>
+        <w:rPr>
+          <w:rFonts w:ascii="Arial" w:hAnsi="Arial" w:cs="Arial"/>
+          <w:b/>
+          <w:sz w:val="24"/>
+          <w:szCs w:val="24"/>
+        </w:rPr>
+        <w:t>mvn</w:t>
+      </w:r>
+      <w:proofErr w:type="spellEnd"/>
+      <w:r>
+        <w:rPr>
+          <w:rFonts w:ascii="Arial" w:hAnsi="Arial" w:cs="Arial"/>
+          <w:b/>
+          <w:sz w:val="24"/>
+          <w:szCs w:val="24"/>
+        </w:rPr>
+        <w:t xml:space="preserve"> test</w:t>
+      </w:r>
+      <w:r>
+        <w:rPr>
+          <w:rFonts w:ascii="Arial" w:hAnsi="Arial" w:cs="Arial"/>
+          <w:sz w:val="24"/>
+          <w:szCs w:val="24"/>
+        </w:rPr>
+        <w:t xml:space="preserve"> on the computer. The </w:t>
+      </w:r>
+      <w:proofErr w:type="spellStart"/>
+      <w:r>
+        <w:rPr>
+          <w:rFonts w:ascii="Arial" w:hAnsi="Arial" w:cs="Arial"/>
+          <w:b/>
+          <w:sz w:val="24"/>
+          <w:szCs w:val="24"/>
+        </w:rPr>
+        <w:t>mvn</w:t>
+      </w:r>
+      <w:proofErr w:type="spellEnd"/>
+      <w:r>
+        <w:rPr>
+          <w:rFonts w:ascii="Arial" w:hAnsi="Arial" w:cs="Arial"/>
+          <w:b/>
+          <w:sz w:val="24"/>
+          <w:szCs w:val="24"/>
+        </w:rPr>
+        <w:t xml:space="preserve"> clean</w:t>
+      </w:r>
+      <w:r>
+        <w:rPr>
+          <w:rFonts w:ascii="Arial" w:hAnsi="Arial" w:cs="Arial"/>
+          <w:sz w:val="24"/>
+          <w:szCs w:val="24"/>
+        </w:rPr>
+        <w:t xml:space="preserve"> package command removes old build files, compiles the project, runs the tests, and creates a WAR file. The </w:t>
+      </w:r>
+      <w:proofErr w:type="spellStart"/>
+      <w:r>
+        <w:rPr>
+          <w:rFonts w:ascii="Arial" w:hAnsi="Arial" w:cs="Arial"/>
+          <w:b/>
+          <w:sz w:val="24"/>
+          <w:szCs w:val="24"/>
+        </w:rPr>
+        <w:t>mvn</w:t>
+      </w:r>
+      <w:proofErr w:type="spellEnd"/>
+      <w:r>
+        <w:rPr>
+          <w:rFonts w:ascii="Arial" w:hAnsi="Arial" w:cs="Arial"/>
+          <w:b/>
+          <w:sz w:val="24"/>
+          <w:szCs w:val="24"/>
+        </w:rPr>
+        <w:t xml:space="preserve"> test</w:t>
+      </w:r>
+      <w:r>
+        <w:rPr>
+          <w:rFonts w:ascii="Arial" w:hAnsi="Arial" w:cs="Arial"/>
+          <w:sz w:val="24"/>
+          <w:szCs w:val="24"/>
+        </w:rPr>
+        <w:t xml:space="preserve"> command is used to run unit tests. When the tests were first executed, some of them failed, which showed that there were logic errors in the application. </w:t>
+      </w:r>
+    </w:p>
+    <w:p>
+      <w:pPr>
+        <w:spacing w:line="360" w:lineRule="auto"/>
+        <w:jc w:val="both"/>
+        <w:rPr>
+          <w:rFonts w:ascii="Arial" w:hAnsi="Arial" w:cs="Arial"/>
+          <w:sz w:val="24"/>
+          <w:szCs w:val="24"/>
+        </w:rPr>
+      </w:pPr>
+    </w:p>
+    <w:p>
+      <w:pPr>
+        <w:spacing w:line="360" w:lineRule="auto"/>
+        <w:jc w:val="both"/>
+        <w:rPr>
+          <w:rFonts w:ascii="Arial" w:hAnsi="Arial" w:cs="Arial"/>
+          <w:sz w:val="24"/>
+          <w:szCs w:val="24"/>
+        </w:rPr>
+      </w:pPr>
+      <w:r>
+        <w:rPr>
+          <w:rFonts w:ascii="Arial" w:hAnsi="Arial" w:cs="Arial"/>
+          <w:sz w:val="24"/>
+          <w:szCs w:val="24"/>
+        </w:rPr>
+        <w:t>These failed tests helped us identify problems and guided us in fixing the bugs in the system.</w:t>
+      </w:r>
+    </w:p>
+    <w:p>
+      <w:pPr>
+        <w:spacing w:line="360" w:lineRule="auto"/>
+        <w:jc w:val="both"/>
+        <w:rPr>
+          <w:rFonts w:ascii="Arial" w:hAnsi="Arial" w:cs="Arial"/>
+          <w:b/>
+          <w:sz w:val="28"/>
+          <w:szCs w:val="28"/>
+        </w:rPr>
+      </w:pPr>
+      <w:r>
+        <w:rPr>
+          <w:rFonts w:ascii="Arial" w:hAnsi="Arial" w:cs="Arial"/>
+          <w:b/>
+          <w:sz w:val="28"/>
+          <w:szCs w:val="28"/>
+        </w:rPr>
+        <w:t>Screenshots</w:t>
+      </w:r>
+    </w:p>
+    <w:p>
+      <w:pPr>
+        <w:spacing w:line="360" w:lineRule="auto"/>
+        <w:jc w:val="both"/>
+        <w:rPr>
+          <w:rFonts w:ascii="Arial" w:hAnsi="Arial" w:cs="Arial"/>
+          <w:b/>
+          <w:sz w:val="28"/>
+          <w:szCs w:val="28"/>
+        </w:rPr>
+      </w:pPr>
+      <w:r>
+        <w:rPr>
+          <w:rFonts w:ascii="Arial" w:hAnsi="Arial" w:cs="Arial"/>
+          <w:b/>
+          <w:sz w:val="28"/>
+          <w:szCs w:val="28"/>
+        </w:rPr>
+        <w:t>5.1</w:t>
+      </w:r>
+      <w:r>
+        <w:rPr>
+          <w:rFonts w:ascii="Arial" w:hAnsi="Arial" w:cs="Arial"/>
+          <w:b/>
+          <w:sz w:val="28"/>
+          <w:szCs w:val="28"/>
+        </w:rPr>
+        <w:t xml:space="preserve"> </w:t>
+      </w:r>
+      <w:r>
+        <w:rPr>
+          <w:rFonts w:ascii="Arial" w:hAnsi="Arial" w:cs="Arial"/>
+          <w:b/>
+          <w:sz w:val="28"/>
+          <w:szCs w:val="28"/>
+        </w:rPr>
+        <w:t>Maven Build Output</w:t>
+      </w:r>
+    </w:p>
+    <w:p>
+      <w:pPr>
+        <w:spacing w:line="360" w:lineRule="auto"/>
+        <w:jc w:val="both"/>
+        <w:rPr>
+          <w:rFonts w:ascii="Arial" w:hAnsi="Arial" w:cs="Arial"/>
+          <w:b/>
+          <w:sz w:val="28"/>
+          <w:szCs w:val="28"/>
+        </w:rPr>
+      </w:pPr>
+      <w:r>
+        <w:rPr>
+          <w:rFonts w:ascii="Arial" w:hAnsi="Arial" w:cs="Arial"/>
+          <w:b/>
+          <w:noProof/>
+          <w:sz w:val="28"/>
+          <w:szCs w:val="28"/>
+          <w:lang w:eastAsia="en-ZA"/>
+          <w14:ligatures w14:val="none"/>
+        </w:rPr>
+        <w:drawing>
+          <wp:inline distT="0" distB="0" distL="0" distR="0">
+            <wp:extent cx="6309360" cy="3639726"/>
+            <wp:effectExtent l="152400" t="152400" r="358140" b="361315"/>
+            <wp:docPr id="6" name="Picture 6"/>
+            <wp:cNvGraphicFramePr>
+              <a:graphicFrameLocks xmlns:a="http://schemas.openxmlformats.org/drawingml/2006/main" noChangeAspect="1"/>
+            </wp:cNvGraphicFramePr>
+            <a:graphic xmlns:a="http://schemas.openxmlformats.org/drawingml/2006/main">
+              <a:graphicData uri="http://schemas.openxmlformats.org/drawingml/2006/picture">
+                <pic:pic xmlns:pic="http://schemas.openxmlformats.org/drawingml/2006/picture">
+                  <pic:nvPicPr>
+                    <pic:cNvPr id="6" name="Screenshot 2026-05-17 213120.png"/>
+                    <pic:cNvPicPr/>
+                  </pic:nvPicPr>
+                  <pic:blipFill>
+                    <a:blip r:embed="rId13">
+                      <a:extLst>
+                        <a:ext uri="{28A0092B-C50C-407E-A947-70E740481C1C}">
+                          <a14:useLocalDpi xmlns:a14="http://schemas.microsoft.com/office/drawing/2010/main" val="0"/>
+                        </a:ext>
+                      </a:extLst>
+                    </a:blip>
+                    <a:stretch>
+                      <a:fillRect/>
+                    </a:stretch>
+                  </pic:blipFill>
+                  <pic:spPr>
+                    <a:xfrm>
+                      <a:off x="0" y="0"/>
+                      <a:ext cx="6312082" cy="3641296"/>
+                    </a:xfrm>
+                    <a:prstGeom prst="rect">
+                      <a:avLst/>
+                    </a:prstGeom>
+                    <a:ln>
+                      <a:noFill/>
+                    </a:ln>
+                    <a:effectLst>
+                      <a:outerShdw blurRad="292100" dist="139700" dir="2700000" algn="tl" rotWithShape="0">
+                        <a:srgbClr val="333333">
+                          <a:alpha val="65000"/>
+                        </a:srgbClr>
+                      </a:outerShdw>
+                    </a:effectLst>
+                  </pic:spPr>
+                </pic:pic>
+              </a:graphicData>
+            </a:graphic>
+          </wp:inline>
+        </w:drawing>
+      </w:r>
+    </w:p>
+    <w:p>
+      <w:pPr>
+        <w:spacing w:line="360" w:lineRule="auto"/>
+        <w:jc w:val="both"/>
+        <w:rPr>
+          <w:rFonts w:ascii="Arial" w:hAnsi="Arial" w:cs="Arial"/>
+          <w:b/>
+          <w:sz w:val="24"/>
+          <w:szCs w:val="24"/>
+        </w:rPr>
+      </w:pPr>
+    </w:p>
+    <w:p>
+      <w:pPr>
+        <w:spacing w:line="360" w:lineRule="auto"/>
+        <w:jc w:val="both"/>
+        <w:rPr>
+          <w:rFonts w:ascii="Arial" w:hAnsi="Arial" w:cs="Arial"/>
+          <w:b/>
+          <w:sz w:val="28"/>
+          <w:szCs w:val="28"/>
+        </w:rPr>
+      </w:pPr>
+      <w:r>
+        <w:rPr>
+          <w:rFonts w:ascii="Arial" w:hAnsi="Arial" w:cs="Arial"/>
+          <w:b/>
+          <w:sz w:val="28"/>
+          <w:szCs w:val="28"/>
+        </w:rPr>
+        <w:t>6. Bug Identification and Resolution</w:t>
+      </w:r>
+    </w:p>
+    <w:p>
+      <w:pPr>
+        <w:spacing w:line="360" w:lineRule="auto"/>
+        <w:jc w:val="both"/>
+        <w:rPr>
+          <w:rFonts w:ascii="Arial" w:hAnsi="Arial" w:cs="Arial"/>
+          <w:b/>
+          <w:sz w:val="28"/>
+          <w:szCs w:val="28"/>
+        </w:rPr>
+      </w:pPr>
+    </w:p>
+    <w:p>
+      <w:pPr>
+        <w:spacing w:line="360" w:lineRule="auto"/>
+        <w:jc w:val="both"/>
+        <w:rPr>
+          <w:rFonts w:ascii="Arial" w:hAnsi="Arial" w:cs="Arial"/>
+          <w:sz w:val="24"/>
+          <w:szCs w:val="24"/>
+        </w:rPr>
+      </w:pPr>
+      <w:r>
+        <w:rPr>
+          <w:rFonts w:ascii="Arial" w:hAnsi="Arial" w:cs="Arial"/>
+          <w:sz w:val="24"/>
+          <w:szCs w:val="24"/>
+        </w:rPr>
+        <w:t xml:space="preserve">The application had several logic errors in the </w:t>
+      </w:r>
+      <w:proofErr w:type="spellStart"/>
+      <w:r>
+        <w:rPr>
+          <w:rFonts w:ascii="Arial" w:hAnsi="Arial" w:cs="Arial"/>
+          <w:sz w:val="24"/>
+          <w:szCs w:val="24"/>
+        </w:rPr>
+        <w:t>GradeCalculator</w:t>
+      </w:r>
+      <w:proofErr w:type="spellEnd"/>
+      <w:r>
+        <w:rPr>
+          <w:rFonts w:ascii="Arial" w:hAnsi="Arial" w:cs="Arial"/>
+          <w:sz w:val="24"/>
+          <w:szCs w:val="24"/>
+        </w:rPr>
+        <w:t>. Java file. The QA and bug fixing team found these errors during unit testing and fixed them according to the required business rules.</w:t>
+      </w:r>
+    </w:p>
+    <w:p>
+      <w:pPr>
+        <w:spacing w:line="360" w:lineRule="auto"/>
+        <w:jc w:val="both"/>
+        <w:rPr>
+          <w:rFonts w:ascii="Arial" w:hAnsi="Arial" w:cs="Arial"/>
+          <w:b/>
+          <w:sz w:val="28"/>
+          <w:szCs w:val="28"/>
+        </w:rPr>
+      </w:pPr>
+      <w:r>
+        <w:rPr>
+          <w:rFonts w:ascii="Arial" w:hAnsi="Arial" w:cs="Arial"/>
+          <w:b/>
+          <w:sz w:val="28"/>
+          <w:szCs w:val="28"/>
+        </w:rPr>
+        <w:t>6.1 Bug Report Table</w:t>
+      </w:r>
+    </w:p>
+    <w:tbl>
+      <w:tblPr>
+        <w:tblStyle w:val="TableGrid"/>
+        <w:tblW w:w="10242" w:type="dxa"/>
+        <w:tblInd w:w="279" w:type="dxa"/>
+        <w:tblLook w:val="04A0" w:firstRow="1" w:lastRow="0" w:firstColumn="1" w:lastColumn="0" w:noHBand="0" w:noVBand="1"/>
+      </w:tblPr>
+      <w:tblGrid>
+        <w:gridCol w:w="689"/>
+        <w:gridCol w:w="4293"/>
+        <w:gridCol w:w="2630"/>
+        <w:gridCol w:w="2630"/>
+      </w:tblGrid>
+      <w:tr>
+        <w:trPr>
+          <w:trHeight w:val="471"/>
+        </w:trPr>
+        <w:tc>
+          <w:tcPr>
+            <w:tcW w:w="689" w:type="dxa"/>
+          </w:tcPr>
+          <w:p>
+            <w:pPr>
+              <w:jc w:val="both"/>
+              <w:rPr>
+                <w:rFonts w:ascii="Arial" w:hAnsi="Arial" w:cs="Arial"/>
+                <w:sz w:val="24"/>
+                <w:szCs w:val="24"/>
+              </w:rPr>
+            </w:pPr>
+            <w:r>
+              <w:rPr>
+                <w:rFonts w:ascii="Arial" w:hAnsi="Arial" w:cs="Arial"/>
+                <w:sz w:val="24"/>
+                <w:szCs w:val="24"/>
+              </w:rPr>
+              <w:t>Bug</w:t>
+            </w:r>
+          </w:p>
+        </w:tc>
+        <w:tc>
+          <w:tcPr>
+            <w:tcW w:w="4293" w:type="dxa"/>
+          </w:tcPr>
+          <w:p>
+            <w:pPr>
+              <w:jc w:val="both"/>
+              <w:rPr>
+                <w:rFonts w:ascii="Arial" w:hAnsi="Arial" w:cs="Arial"/>
+                <w:sz w:val="24"/>
+                <w:szCs w:val="24"/>
+              </w:rPr>
+            </w:pPr>
+            <w:r>
+              <w:rPr>
+                <w:rFonts w:ascii="Arial" w:hAnsi="Arial" w:cs="Arial"/>
+                <w:sz w:val="24"/>
+                <w:szCs w:val="24"/>
+              </w:rPr>
+              <w:t>Problem Identified</w:t>
+            </w:r>
+          </w:p>
+        </w:tc>
+        <w:tc>
+          <w:tcPr>
+            <w:tcW w:w="2630" w:type="dxa"/>
+          </w:tcPr>
+          <w:p>
+            <w:pPr>
+              <w:jc w:val="both"/>
+              <w:rPr>
+                <w:rFonts w:ascii="Arial" w:hAnsi="Arial" w:cs="Arial"/>
+                <w:sz w:val="24"/>
+                <w:szCs w:val="24"/>
+              </w:rPr>
+            </w:pPr>
+            <w:r>
+              <w:rPr>
+                <w:rFonts w:ascii="Arial" w:hAnsi="Arial" w:cs="Arial"/>
+                <w:sz w:val="24"/>
+                <w:szCs w:val="24"/>
+              </w:rPr>
+              <w:t>Expected Behaviour</w:t>
+            </w:r>
+          </w:p>
+        </w:tc>
+        <w:tc>
+          <w:tcPr>
+            <w:tcW w:w="2630" w:type="dxa"/>
+          </w:tcPr>
+          <w:p>
+            <w:pPr>
+              <w:jc w:val="both"/>
+              <w:rPr>
+                <w:rFonts w:ascii="Arial" w:hAnsi="Arial" w:cs="Arial"/>
+                <w:sz w:val="24"/>
+                <w:szCs w:val="24"/>
+              </w:rPr>
+            </w:pPr>
+            <w:r>
+              <w:rPr>
+                <w:rFonts w:ascii="Arial" w:hAnsi="Arial" w:cs="Arial"/>
+                <w:sz w:val="24"/>
+                <w:szCs w:val="24"/>
+              </w:rPr>
+              <w:t>Fix Applied</w:t>
+            </w:r>
+          </w:p>
+        </w:tc>
+      </w:tr>
+      <w:tr>
+        <w:trPr>
+          <w:trHeight w:val="785"/>
+        </w:trPr>
+        <w:tc>
+          <w:tcPr>
+            <w:tcW w:w="689" w:type="dxa"/>
+          </w:tcPr>
+          <w:p>
+            <w:pPr>
+              <w:jc w:val="both"/>
+              <w:rPr>
+                <w:rFonts w:ascii="Arial" w:hAnsi="Arial" w:cs="Arial"/>
+                <w:sz w:val="24"/>
+                <w:szCs w:val="24"/>
+              </w:rPr>
+            </w:pPr>
+            <w:r>
+              <w:rPr>
+                <w:rFonts w:ascii="Arial" w:hAnsi="Arial" w:cs="Arial"/>
+                <w:sz w:val="24"/>
+                <w:szCs w:val="24"/>
+              </w:rPr>
+              <w:t>1</w:t>
+            </w:r>
+          </w:p>
+        </w:tc>
+        <w:tc>
+          <w:tcPr>
+            <w:tcW w:w="4293" w:type="dxa"/>
+          </w:tcPr>
+          <w:p>
+            <w:pPr>
+              <w:jc w:val="both"/>
+              <w:rPr>
+                <w:rFonts w:ascii="Arial" w:hAnsi="Arial" w:cs="Arial"/>
+                <w:sz w:val="24"/>
+                <w:szCs w:val="24"/>
+              </w:rPr>
+            </w:pPr>
+            <w:r>
+              <w:rPr>
+                <w:rFonts w:ascii="Arial" w:hAnsi="Arial" w:cs="Arial"/>
+                <w:sz w:val="24"/>
+                <w:szCs w:val="24"/>
+              </w:rPr>
+              <w:t>Final mark formula weights swapped</w:t>
+            </w:r>
+          </w:p>
+        </w:tc>
+        <w:tc>
+          <w:tcPr>
+            <w:tcW w:w="2630" w:type="dxa"/>
+          </w:tcPr>
+          <w:p>
+            <w:pPr>
+              <w:jc w:val="both"/>
+              <w:rPr>
+                <w:rFonts w:ascii="Arial" w:hAnsi="Arial" w:cs="Arial"/>
+                <w:sz w:val="24"/>
+                <w:szCs w:val="24"/>
+              </w:rPr>
+            </w:pPr>
+            <w:r>
+              <w:rPr>
+                <w:rFonts w:ascii="Arial" w:hAnsi="Arial" w:cs="Arial"/>
+                <w:sz w:val="24"/>
+                <w:szCs w:val="24"/>
+              </w:rPr>
+              <w:t>Semester 40% ,Exam 60%</w:t>
+            </w:r>
+          </w:p>
+        </w:tc>
+        <w:tc>
+          <w:tcPr>
+            <w:tcW w:w="2630" w:type="dxa"/>
+          </w:tcPr>
+          <w:p>
+            <w:pPr>
+              <w:jc w:val="both"/>
+              <w:rPr>
+                <w:rFonts w:ascii="Arial" w:hAnsi="Arial" w:cs="Arial"/>
+                <w:sz w:val="24"/>
+                <w:szCs w:val="24"/>
+              </w:rPr>
+            </w:pPr>
+            <w:r>
+              <w:rPr>
+                <w:rFonts w:ascii="Arial" w:hAnsi="Arial" w:cs="Arial"/>
+                <w:sz w:val="24"/>
+                <w:szCs w:val="24"/>
+              </w:rPr>
+              <w:t>Correct admission logic</w:t>
+            </w:r>
+          </w:p>
+        </w:tc>
+      </w:tr>
+      <w:tr>
+        <w:trPr>
+          <w:trHeight w:val="823"/>
+        </w:trPr>
+        <w:tc>
+          <w:tcPr>
+            <w:tcW w:w="689" w:type="dxa"/>
+          </w:tcPr>
+          <w:p>
+            <w:pPr>
+              <w:jc w:val="both"/>
+              <w:rPr>
+                <w:rFonts w:ascii="Arial" w:hAnsi="Arial" w:cs="Arial"/>
+                <w:sz w:val="24"/>
+                <w:szCs w:val="24"/>
+              </w:rPr>
+            </w:pPr>
+            <w:r>
+              <w:rPr>
+                <w:rFonts w:ascii="Arial" w:hAnsi="Arial" w:cs="Arial"/>
+                <w:sz w:val="24"/>
+                <w:szCs w:val="24"/>
+              </w:rPr>
+              <w:t>2</w:t>
+            </w:r>
+          </w:p>
+        </w:tc>
+        <w:tc>
+          <w:tcPr>
+            <w:tcW w:w="4293" w:type="dxa"/>
+          </w:tcPr>
+          <w:p>
+            <w:pPr>
+              <w:jc w:val="both"/>
+              <w:rPr>
+                <w:rFonts w:ascii="Arial" w:hAnsi="Arial" w:cs="Arial"/>
+                <w:sz w:val="24"/>
+                <w:szCs w:val="24"/>
+              </w:rPr>
+            </w:pPr>
+            <w:r>
+              <w:rPr>
+                <w:rFonts w:ascii="Arial" w:hAnsi="Arial" w:cs="Arial"/>
+                <w:sz w:val="24"/>
+                <w:szCs w:val="24"/>
+              </w:rPr>
+              <w:t>Incorrect grade boundaries</w:t>
+            </w:r>
+          </w:p>
+        </w:tc>
+        <w:tc>
+          <w:tcPr>
+            <w:tcW w:w="2630" w:type="dxa"/>
+          </w:tcPr>
+          <w:p>
+            <w:pPr>
+              <w:jc w:val="both"/>
+              <w:rPr>
+                <w:rFonts w:ascii="Arial" w:hAnsi="Arial" w:cs="Arial"/>
+                <w:sz w:val="24"/>
+                <w:szCs w:val="24"/>
+              </w:rPr>
+            </w:pPr>
+            <w:r>
+              <w:rPr>
+                <w:rFonts w:ascii="Arial" w:hAnsi="Arial" w:cs="Arial"/>
+                <w:sz w:val="24"/>
+                <w:szCs w:val="24"/>
+              </w:rPr>
+              <w:t>Correct grade ranges applied</w:t>
+            </w:r>
+          </w:p>
+        </w:tc>
+        <w:tc>
+          <w:tcPr>
+            <w:tcW w:w="2630" w:type="dxa"/>
+          </w:tcPr>
+          <w:p>
+            <w:pPr>
+              <w:jc w:val="both"/>
+              <w:rPr>
+                <w:rFonts w:ascii="Arial" w:hAnsi="Arial" w:cs="Arial"/>
+                <w:sz w:val="24"/>
+                <w:szCs w:val="24"/>
+              </w:rPr>
+            </w:pPr>
+            <w:r>
+              <w:rPr>
+                <w:rFonts w:ascii="Arial" w:hAnsi="Arial" w:cs="Arial"/>
+                <w:sz w:val="24"/>
+                <w:szCs w:val="24"/>
+              </w:rPr>
+              <w:t>Fixed average calculation</w:t>
+            </w:r>
+          </w:p>
+        </w:tc>
+      </w:tr>
+      <w:tr>
+        <w:trPr>
+          <w:trHeight w:val="823"/>
+        </w:trPr>
+        <w:tc>
+          <w:tcPr>
+            <w:tcW w:w="689" w:type="dxa"/>
+          </w:tcPr>
+          <w:p>
+            <w:pPr>
+              <w:jc w:val="both"/>
+              <w:rPr>
+                <w:rFonts w:ascii="Arial" w:hAnsi="Arial" w:cs="Arial"/>
+                <w:sz w:val="24"/>
+                <w:szCs w:val="24"/>
+              </w:rPr>
+            </w:pPr>
+            <w:r>
+              <w:rPr>
+                <w:rFonts w:ascii="Arial" w:hAnsi="Arial" w:cs="Arial"/>
+                <w:sz w:val="24"/>
+                <w:szCs w:val="24"/>
+              </w:rPr>
+              <w:t>3</w:t>
+            </w:r>
+          </w:p>
+        </w:tc>
+        <w:tc>
+          <w:tcPr>
+            <w:tcW w:w="4293" w:type="dxa"/>
+          </w:tcPr>
+          <w:p>
+            <w:pPr>
+              <w:jc w:val="both"/>
+              <w:rPr>
+                <w:rFonts w:ascii="Arial" w:hAnsi="Arial" w:cs="Arial"/>
+                <w:sz w:val="24"/>
+                <w:szCs w:val="24"/>
+              </w:rPr>
+            </w:pPr>
+            <w:r>
+              <w:rPr>
+                <w:rFonts w:ascii="Arial" w:hAnsi="Arial" w:cs="Arial"/>
+                <w:sz w:val="24"/>
+                <w:szCs w:val="24"/>
+              </w:rPr>
+              <w:t>Incorrect exam admission threshold</w:t>
+            </w:r>
+          </w:p>
+        </w:tc>
+        <w:tc>
+          <w:tcPr>
+            <w:tcW w:w="2630" w:type="dxa"/>
+          </w:tcPr>
+          <w:p>
+            <w:pPr>
+              <w:jc w:val="both"/>
+              <w:rPr>
+                <w:rFonts w:ascii="Arial" w:hAnsi="Arial" w:cs="Arial"/>
+                <w:sz w:val="24"/>
+                <w:szCs w:val="24"/>
+              </w:rPr>
+            </w:pPr>
+            <w:r>
+              <w:rPr>
+                <w:rFonts w:ascii="Arial" w:hAnsi="Arial" w:cs="Arial"/>
+                <w:sz w:val="24"/>
+                <w:szCs w:val="24"/>
+              </w:rPr>
+              <w:t>Admission at &gt;= 40</w:t>
+            </w:r>
+          </w:p>
+        </w:tc>
+        <w:tc>
+          <w:tcPr>
+            <w:tcW w:w="2630" w:type="dxa"/>
+          </w:tcPr>
+          <w:p>
+            <w:pPr>
+              <w:jc w:val="both"/>
+              <w:rPr>
+                <w:rFonts w:ascii="Arial" w:hAnsi="Arial" w:cs="Arial"/>
+                <w:sz w:val="24"/>
+                <w:szCs w:val="24"/>
+              </w:rPr>
+            </w:pPr>
+            <w:r>
+              <w:rPr>
+                <w:rFonts w:ascii="Arial" w:hAnsi="Arial" w:cs="Arial"/>
+                <w:sz w:val="24"/>
+                <w:szCs w:val="24"/>
+              </w:rPr>
+              <w:t>Corrected admission logic</w:t>
+            </w:r>
+          </w:p>
+        </w:tc>
+      </w:tr>
+      <w:tr>
+        <w:trPr>
+          <w:trHeight w:val="823"/>
+        </w:trPr>
+        <w:tc>
+          <w:tcPr>
+            <w:tcW w:w="689" w:type="dxa"/>
+          </w:tcPr>
+          <w:p>
+            <w:pPr>
+              <w:jc w:val="both"/>
+              <w:rPr>
+                <w:rFonts w:ascii="Arial" w:hAnsi="Arial" w:cs="Arial"/>
+                <w:sz w:val="24"/>
+                <w:szCs w:val="24"/>
+              </w:rPr>
+            </w:pPr>
+            <w:r>
+              <w:rPr>
+                <w:rFonts w:ascii="Arial" w:hAnsi="Arial" w:cs="Arial"/>
+                <w:sz w:val="24"/>
+                <w:szCs w:val="24"/>
+              </w:rPr>
+              <w:t>4</w:t>
+            </w:r>
+          </w:p>
+        </w:tc>
+        <w:tc>
+          <w:tcPr>
+            <w:tcW w:w="4293" w:type="dxa"/>
+          </w:tcPr>
+          <w:p>
+            <w:pPr>
+              <w:jc w:val="both"/>
+              <w:rPr>
+                <w:rFonts w:ascii="Arial" w:hAnsi="Arial" w:cs="Arial"/>
+                <w:sz w:val="24"/>
+                <w:szCs w:val="24"/>
+              </w:rPr>
+            </w:pPr>
+            <w:r>
+              <w:rPr>
+                <w:rFonts w:ascii="Arial" w:hAnsi="Arial" w:cs="Arial"/>
+                <w:sz w:val="24"/>
+                <w:szCs w:val="24"/>
+              </w:rPr>
+              <w:t>Class average off-by-one error</w:t>
+            </w:r>
+          </w:p>
+        </w:tc>
+        <w:tc>
+          <w:tcPr>
+            <w:tcW w:w="2630" w:type="dxa"/>
+          </w:tcPr>
+          <w:p>
+            <w:pPr>
+              <w:jc w:val="both"/>
+              <w:rPr>
+                <w:rFonts w:ascii="Arial" w:hAnsi="Arial" w:cs="Arial"/>
+                <w:sz w:val="24"/>
+                <w:szCs w:val="24"/>
+              </w:rPr>
+            </w:pPr>
+            <w:r>
+              <w:rPr>
+                <w:rFonts w:ascii="Arial" w:hAnsi="Arial" w:cs="Arial"/>
+                <w:sz w:val="24"/>
+                <w:szCs w:val="24"/>
+              </w:rPr>
+              <w:t>Divide by correct array length</w:t>
+            </w:r>
+          </w:p>
+        </w:tc>
+        <w:tc>
+          <w:tcPr>
+            <w:tcW w:w="2630" w:type="dxa"/>
+          </w:tcPr>
+          <w:p>
+            <w:pPr>
+              <w:jc w:val="both"/>
+              <w:rPr>
+                <w:rFonts w:ascii="Arial" w:hAnsi="Arial" w:cs="Arial"/>
+                <w:sz w:val="24"/>
+                <w:szCs w:val="24"/>
+              </w:rPr>
+            </w:pPr>
+            <w:r>
+              <w:rPr>
+                <w:rFonts w:ascii="Arial" w:hAnsi="Arial" w:cs="Arial"/>
+                <w:sz w:val="24"/>
+                <w:szCs w:val="24"/>
+              </w:rPr>
+              <w:t>Fixed average calculation</w:t>
+            </w:r>
+          </w:p>
+        </w:tc>
+      </w:tr>
+      <w:tr>
+        <w:trPr>
+          <w:trHeight w:val="785"/>
+        </w:trPr>
+        <w:tc>
+          <w:tcPr>
+            <w:tcW w:w="689" w:type="dxa"/>
+          </w:tcPr>
+          <w:p>
+            <w:pPr>
+              <w:jc w:val="both"/>
+              <w:rPr>
+                <w:rFonts w:ascii="Arial" w:hAnsi="Arial" w:cs="Arial"/>
+                <w:sz w:val="24"/>
+                <w:szCs w:val="24"/>
+              </w:rPr>
+            </w:pPr>
+            <w:r>
+              <w:rPr>
+                <w:rFonts w:ascii="Arial" w:hAnsi="Arial" w:cs="Arial"/>
+                <w:sz w:val="24"/>
+                <w:szCs w:val="24"/>
+              </w:rPr>
+              <w:t>5</w:t>
+            </w:r>
+          </w:p>
+        </w:tc>
+        <w:tc>
+          <w:tcPr>
+            <w:tcW w:w="4293" w:type="dxa"/>
+          </w:tcPr>
+          <w:p>
+            <w:pPr>
+              <w:jc w:val="both"/>
+              <w:rPr>
+                <w:rFonts w:ascii="Arial" w:hAnsi="Arial" w:cs="Arial"/>
+                <w:sz w:val="24"/>
+                <w:szCs w:val="24"/>
+              </w:rPr>
+            </w:pPr>
+            <w:r>
+              <w:rPr>
+                <w:rFonts w:ascii="Arial" w:hAnsi="Arial" w:cs="Arial"/>
+                <w:sz w:val="24"/>
+                <w:szCs w:val="24"/>
+              </w:rPr>
+              <w:t>Incorrect pass rate calculation</w:t>
+            </w:r>
+          </w:p>
+        </w:tc>
+        <w:tc>
+          <w:tcPr>
+            <w:tcW w:w="2630" w:type="dxa"/>
+          </w:tcPr>
+          <w:p>
+            <w:pPr>
+              <w:jc w:val="both"/>
+              <w:rPr>
+                <w:rFonts w:ascii="Arial" w:hAnsi="Arial" w:cs="Arial"/>
+                <w:sz w:val="24"/>
+                <w:szCs w:val="24"/>
+              </w:rPr>
+            </w:pPr>
+            <w:r>
+              <w:rPr>
+                <w:rFonts w:ascii="Arial" w:hAnsi="Arial" w:cs="Arial"/>
+                <w:sz w:val="24"/>
+                <w:szCs w:val="24"/>
+              </w:rPr>
+              <w:t>Pass mark &gt;=50</w:t>
+            </w:r>
+          </w:p>
+        </w:tc>
+        <w:tc>
+          <w:tcPr>
+            <w:tcW w:w="2630" w:type="dxa"/>
+          </w:tcPr>
+          <w:p>
+            <w:pPr>
+              <w:jc w:val="both"/>
+              <w:rPr>
+                <w:rFonts w:ascii="Arial" w:hAnsi="Arial" w:cs="Arial"/>
+                <w:sz w:val="24"/>
+                <w:szCs w:val="24"/>
+              </w:rPr>
+            </w:pPr>
+            <w:r>
+              <w:rPr>
+                <w:rFonts w:ascii="Arial" w:hAnsi="Arial" w:cs="Arial"/>
+                <w:sz w:val="24"/>
+                <w:szCs w:val="24"/>
+              </w:rPr>
+              <w:t>Corrected pass rate logic</w:t>
+            </w:r>
+          </w:p>
+        </w:tc>
+      </w:tr>
+      <w:tr>
+        <w:trPr>
+          <w:trHeight w:val="823"/>
+        </w:trPr>
+        <w:tc>
+          <w:tcPr>
+            <w:tcW w:w="689" w:type="dxa"/>
+          </w:tcPr>
+          <w:p>
+            <w:pPr>
+              <w:jc w:val="both"/>
+              <w:rPr>
+                <w:rFonts w:ascii="Arial" w:hAnsi="Arial" w:cs="Arial"/>
+                <w:sz w:val="24"/>
+                <w:szCs w:val="24"/>
+              </w:rPr>
+            </w:pPr>
+            <w:r>
+              <w:rPr>
+                <w:rFonts w:ascii="Arial" w:hAnsi="Arial" w:cs="Arial"/>
+                <w:sz w:val="24"/>
+                <w:szCs w:val="24"/>
+              </w:rPr>
+              <w:t>6</w:t>
+            </w:r>
+          </w:p>
+        </w:tc>
+        <w:tc>
+          <w:tcPr>
+            <w:tcW w:w="4293" w:type="dxa"/>
+          </w:tcPr>
+          <w:p>
+            <w:pPr>
+              <w:jc w:val="both"/>
+              <w:rPr>
+                <w:rFonts w:ascii="Arial" w:hAnsi="Arial" w:cs="Arial"/>
+                <w:sz w:val="24"/>
+                <w:szCs w:val="24"/>
+              </w:rPr>
+            </w:pPr>
+            <w:r>
+              <w:rPr>
+                <w:rFonts w:ascii="Arial" w:hAnsi="Arial" w:cs="Arial"/>
+                <w:sz w:val="24"/>
+                <w:szCs w:val="24"/>
+              </w:rPr>
+              <w:t>Highest mark method returned lowest value</w:t>
+            </w:r>
+          </w:p>
+        </w:tc>
+        <w:tc>
+          <w:tcPr>
+            <w:tcW w:w="2630" w:type="dxa"/>
+          </w:tcPr>
+          <w:p>
+            <w:pPr>
+              <w:jc w:val="both"/>
+              <w:rPr>
+                <w:rFonts w:ascii="Arial" w:hAnsi="Arial" w:cs="Arial"/>
+                <w:sz w:val="24"/>
+                <w:szCs w:val="24"/>
+              </w:rPr>
+            </w:pPr>
+            <w:r>
+              <w:rPr>
+                <w:rFonts w:ascii="Arial" w:hAnsi="Arial" w:cs="Arial"/>
+                <w:sz w:val="24"/>
+                <w:szCs w:val="24"/>
+              </w:rPr>
+              <w:t>Highest mark returned</w:t>
+            </w:r>
+          </w:p>
+        </w:tc>
+        <w:tc>
+          <w:tcPr>
+            <w:tcW w:w="2630" w:type="dxa"/>
+          </w:tcPr>
+          <w:p>
+            <w:pPr>
+              <w:jc w:val="both"/>
+              <w:rPr>
+                <w:rFonts w:ascii="Arial" w:hAnsi="Arial" w:cs="Arial"/>
+                <w:sz w:val="24"/>
+                <w:szCs w:val="24"/>
+              </w:rPr>
+            </w:pPr>
+            <w:r>
+              <w:rPr>
+                <w:rFonts w:ascii="Arial" w:hAnsi="Arial" w:cs="Arial"/>
+                <w:sz w:val="24"/>
+                <w:szCs w:val="24"/>
+              </w:rPr>
+              <w:t>Corrected comparison operator</w:t>
+            </w:r>
+          </w:p>
+        </w:tc>
+      </w:tr>
+      <w:tr>
+        <w:trPr>
+          <w:trHeight w:val="823"/>
+        </w:trPr>
+        <w:tc>
+          <w:tcPr>
+            <w:tcW w:w="689" w:type="dxa"/>
+          </w:tcPr>
+          <w:p>
+            <w:pPr>
+              <w:jc w:val="both"/>
+              <w:rPr>
+                <w:rFonts w:ascii="Arial" w:hAnsi="Arial" w:cs="Arial"/>
+                <w:sz w:val="24"/>
+                <w:szCs w:val="24"/>
+              </w:rPr>
+            </w:pPr>
+            <w:r>
+              <w:rPr>
+                <w:rFonts w:ascii="Arial" w:hAnsi="Arial" w:cs="Arial"/>
+                <w:sz w:val="24"/>
+                <w:szCs w:val="24"/>
+              </w:rPr>
+              <w:t>7</w:t>
+            </w:r>
+          </w:p>
+        </w:tc>
+        <w:tc>
+          <w:tcPr>
+            <w:tcW w:w="4293" w:type="dxa"/>
+          </w:tcPr>
+          <w:p>
+            <w:pPr>
+              <w:jc w:val="both"/>
+              <w:rPr>
+                <w:rFonts w:ascii="Arial" w:hAnsi="Arial" w:cs="Arial"/>
+                <w:sz w:val="24"/>
+                <w:szCs w:val="24"/>
+              </w:rPr>
+            </w:pPr>
+            <w:r>
+              <w:rPr>
+                <w:rFonts w:ascii="Arial" w:hAnsi="Arial" w:cs="Arial"/>
+                <w:sz w:val="24"/>
+                <w:szCs w:val="24"/>
+              </w:rPr>
+              <w:t>Incorrect</w:t>
+            </w:r>
+            <w:r>
+              <w:rPr>
+                <w:rFonts w:ascii="Arial" w:hAnsi="Arial" w:cs="Arial"/>
+                <w:sz w:val="24"/>
+                <w:szCs w:val="24"/>
+              </w:rPr>
+              <w:t xml:space="preserve"> </w:t>
+            </w:r>
+            <w:r>
+              <w:rPr>
+                <w:rFonts w:ascii="Arial" w:hAnsi="Arial" w:cs="Arial"/>
+                <w:sz w:val="24"/>
+                <w:szCs w:val="24"/>
+              </w:rPr>
+              <w:t xml:space="preserve">supplementary range </w:t>
+            </w:r>
+          </w:p>
+        </w:tc>
+        <w:tc>
+          <w:tcPr>
+            <w:tcW w:w="2630" w:type="dxa"/>
+          </w:tcPr>
+          <w:p>
+            <w:pPr>
+              <w:jc w:val="both"/>
+              <w:rPr>
+                <w:rFonts w:ascii="Arial" w:hAnsi="Arial" w:cs="Arial"/>
+                <w:sz w:val="24"/>
+                <w:szCs w:val="24"/>
+              </w:rPr>
+            </w:pPr>
+            <w:r>
+              <w:rPr>
+                <w:rFonts w:ascii="Arial" w:hAnsi="Arial" w:cs="Arial"/>
+                <w:sz w:val="24"/>
+                <w:szCs w:val="24"/>
+              </w:rPr>
+              <w:t>Supplementary between 45-49</w:t>
+            </w:r>
+          </w:p>
+        </w:tc>
+        <w:tc>
+          <w:tcPr>
+            <w:tcW w:w="2630" w:type="dxa"/>
+          </w:tcPr>
+          <w:p>
+            <w:pPr>
+              <w:jc w:val="both"/>
+              <w:rPr>
+                <w:rFonts w:ascii="Arial" w:hAnsi="Arial" w:cs="Arial"/>
+                <w:sz w:val="24"/>
+                <w:szCs w:val="24"/>
+              </w:rPr>
+            </w:pPr>
+            <w:r>
+              <w:rPr>
+                <w:rFonts w:ascii="Arial" w:hAnsi="Arial" w:cs="Arial"/>
+                <w:sz w:val="24"/>
+                <w:szCs w:val="24"/>
+              </w:rPr>
+              <w:t>Corrected supplementary logic</w:t>
+            </w:r>
+          </w:p>
+        </w:tc>
+      </w:tr>
+      <w:tr>
+        <w:trPr>
+          <w:trHeight w:val="823"/>
+        </w:trPr>
+        <w:tc>
+          <w:tcPr>
+            <w:tcW w:w="689" w:type="dxa"/>
+          </w:tcPr>
+          <w:p>
+            <w:pPr>
+              <w:jc w:val="both"/>
+              <w:rPr>
+                <w:rFonts w:ascii="Arial" w:hAnsi="Arial" w:cs="Arial"/>
+                <w:sz w:val="24"/>
+                <w:szCs w:val="24"/>
+              </w:rPr>
+            </w:pPr>
+            <w:r>
+              <w:rPr>
+                <w:rFonts w:ascii="Arial" w:hAnsi="Arial" w:cs="Arial"/>
+                <w:sz w:val="24"/>
+                <w:szCs w:val="24"/>
+              </w:rPr>
+              <w:t>8</w:t>
+            </w:r>
+          </w:p>
+        </w:tc>
+        <w:tc>
+          <w:tcPr>
+            <w:tcW w:w="4293" w:type="dxa"/>
+          </w:tcPr>
+          <w:p>
+            <w:pPr>
+              <w:jc w:val="both"/>
+              <w:rPr>
+                <w:rFonts w:ascii="Arial" w:hAnsi="Arial" w:cs="Arial"/>
+                <w:sz w:val="24"/>
+                <w:szCs w:val="24"/>
+              </w:rPr>
+            </w:pPr>
+            <w:r>
+              <w:rPr>
+                <w:rFonts w:ascii="Arial" w:hAnsi="Arial" w:cs="Arial"/>
+                <w:sz w:val="24"/>
+                <w:szCs w:val="24"/>
+              </w:rPr>
+              <w:t>Invalid mark validation</w:t>
+            </w:r>
+          </w:p>
+        </w:tc>
+        <w:tc>
+          <w:tcPr>
+            <w:tcW w:w="2630" w:type="dxa"/>
+          </w:tcPr>
+          <w:p>
+            <w:pPr>
+              <w:jc w:val="both"/>
+              <w:rPr>
+                <w:rFonts w:ascii="Arial" w:hAnsi="Arial" w:cs="Arial"/>
+                <w:sz w:val="24"/>
+                <w:szCs w:val="24"/>
+              </w:rPr>
+            </w:pPr>
+            <w:r>
+              <w:rPr>
+                <w:rFonts w:ascii="Arial" w:hAnsi="Arial" w:cs="Arial"/>
+                <w:sz w:val="24"/>
+                <w:szCs w:val="24"/>
+              </w:rPr>
+              <w:t>Only 0-100 valid</w:t>
+            </w:r>
+          </w:p>
+        </w:tc>
+        <w:tc>
+          <w:tcPr>
+            <w:tcW w:w="2630" w:type="dxa"/>
+          </w:tcPr>
+          <w:p>
+            <w:pPr>
+              <w:jc w:val="both"/>
+              <w:rPr>
+                <w:rFonts w:ascii="Arial" w:hAnsi="Arial" w:cs="Arial"/>
+                <w:sz w:val="24"/>
+                <w:szCs w:val="24"/>
+              </w:rPr>
+            </w:pPr>
+            <w:r>
+              <w:rPr>
+                <w:rFonts w:ascii="Arial" w:hAnsi="Arial" w:cs="Arial"/>
+                <w:sz w:val="24"/>
+                <w:szCs w:val="24"/>
+              </w:rPr>
+              <w:t>Added proper validation</w:t>
+            </w:r>
+          </w:p>
+        </w:tc>
+      </w:tr>
+      <w:tr>
+        <w:trPr>
+          <w:trHeight w:val="785"/>
+        </w:trPr>
+        <w:tc>
+          <w:tcPr>
+            <w:tcW w:w="689" w:type="dxa"/>
+          </w:tcPr>
+          <w:p>
+            <w:pPr>
+              <w:jc w:val="both"/>
+              <w:rPr>
+                <w:rFonts w:ascii="Arial" w:hAnsi="Arial" w:cs="Arial"/>
+                <w:sz w:val="24"/>
+                <w:szCs w:val="24"/>
+              </w:rPr>
+            </w:pPr>
+            <w:r>
+              <w:rPr>
+                <w:rFonts w:ascii="Arial" w:hAnsi="Arial" w:cs="Arial"/>
+                <w:sz w:val="24"/>
+                <w:szCs w:val="24"/>
+              </w:rPr>
+              <w:t>9</w:t>
+            </w:r>
+          </w:p>
+        </w:tc>
+        <w:tc>
+          <w:tcPr>
+            <w:tcW w:w="4293" w:type="dxa"/>
+          </w:tcPr>
+          <w:p>
+            <w:pPr>
+              <w:jc w:val="both"/>
+              <w:rPr>
+                <w:rFonts w:ascii="Arial" w:hAnsi="Arial" w:cs="Arial"/>
+                <w:sz w:val="24"/>
+                <w:szCs w:val="24"/>
+              </w:rPr>
+            </w:pPr>
+            <w:r>
+              <w:rPr>
+                <w:rFonts w:ascii="Arial" w:hAnsi="Arial" w:cs="Arial"/>
+                <w:sz w:val="24"/>
+                <w:szCs w:val="24"/>
+              </w:rPr>
+              <w:t>Student</w:t>
+            </w:r>
+            <w:r>
+              <w:rPr>
+                <w:rFonts w:ascii="Arial" w:hAnsi="Arial" w:cs="Arial"/>
+                <w:sz w:val="24"/>
+                <w:szCs w:val="24"/>
+              </w:rPr>
+              <w:t xml:space="preserve"> </w:t>
+            </w:r>
+            <w:r>
+              <w:rPr>
+                <w:rFonts w:ascii="Arial" w:hAnsi="Arial" w:cs="Arial"/>
+                <w:sz w:val="24"/>
+                <w:szCs w:val="24"/>
+              </w:rPr>
+              <w:t>report admission logic inverted</w:t>
+            </w:r>
+          </w:p>
+        </w:tc>
+        <w:tc>
+          <w:tcPr>
+            <w:tcW w:w="2630" w:type="dxa"/>
+          </w:tcPr>
+          <w:p>
+            <w:pPr>
+              <w:jc w:val="both"/>
+              <w:rPr>
+                <w:rFonts w:ascii="Arial" w:hAnsi="Arial" w:cs="Arial"/>
+                <w:sz w:val="24"/>
+                <w:szCs w:val="24"/>
+              </w:rPr>
+            </w:pPr>
+            <w:r>
+              <w:rPr>
+                <w:rFonts w:ascii="Arial" w:hAnsi="Arial" w:cs="Arial"/>
+                <w:sz w:val="24"/>
+                <w:szCs w:val="24"/>
+              </w:rPr>
+              <w:t>Correct admission display</w:t>
+            </w:r>
+          </w:p>
+        </w:tc>
+        <w:tc>
+          <w:tcPr>
+            <w:tcW w:w="2630" w:type="dxa"/>
+          </w:tcPr>
+          <w:p>
+            <w:pPr>
+              <w:jc w:val="both"/>
+              <w:rPr>
+                <w:rFonts w:ascii="Arial" w:hAnsi="Arial" w:cs="Arial"/>
+                <w:sz w:val="24"/>
+                <w:szCs w:val="24"/>
+              </w:rPr>
+            </w:pPr>
+            <w:r>
+              <w:rPr>
+                <w:rFonts w:ascii="Arial" w:hAnsi="Arial" w:cs="Arial"/>
+                <w:sz w:val="24"/>
+                <w:szCs w:val="24"/>
+              </w:rPr>
+              <w:t>Fixed report condition</w:t>
+            </w:r>
+          </w:p>
+        </w:tc>
+      </w:tr>
+      <w:tr>
+        <w:trPr>
+          <w:trHeight w:val="823"/>
+        </w:trPr>
+        <w:tc>
+          <w:tcPr>
+            <w:tcW w:w="689" w:type="dxa"/>
+          </w:tcPr>
+          <w:p>
+            <w:pPr>
+              <w:jc w:val="both"/>
+              <w:rPr>
+                <w:rFonts w:ascii="Arial" w:hAnsi="Arial" w:cs="Arial"/>
+                <w:sz w:val="24"/>
+                <w:szCs w:val="24"/>
+              </w:rPr>
+            </w:pPr>
+            <w:r>
+              <w:rPr>
+                <w:rFonts w:ascii="Arial" w:hAnsi="Arial" w:cs="Arial"/>
+                <w:sz w:val="24"/>
+                <w:szCs w:val="24"/>
+              </w:rPr>
+              <w:t>10</w:t>
+            </w:r>
+          </w:p>
+        </w:tc>
+        <w:tc>
+          <w:tcPr>
+            <w:tcW w:w="4293" w:type="dxa"/>
+          </w:tcPr>
+          <w:p>
+            <w:pPr>
+              <w:jc w:val="both"/>
+              <w:rPr>
+                <w:rFonts w:ascii="Arial" w:hAnsi="Arial" w:cs="Arial"/>
+                <w:sz w:val="24"/>
+                <w:szCs w:val="24"/>
+              </w:rPr>
+            </w:pPr>
+            <w:r>
+              <w:rPr>
+                <w:rFonts w:ascii="Arial" w:hAnsi="Arial" w:cs="Arial"/>
+                <w:sz w:val="24"/>
+                <w:szCs w:val="24"/>
+              </w:rPr>
+              <w:t>TODO test incomplete</w:t>
+            </w:r>
+          </w:p>
+        </w:tc>
+        <w:tc>
+          <w:tcPr>
+            <w:tcW w:w="2630" w:type="dxa"/>
+          </w:tcPr>
+          <w:p>
+            <w:pPr>
+              <w:jc w:val="both"/>
+              <w:rPr>
+                <w:rFonts w:ascii="Arial" w:hAnsi="Arial" w:cs="Arial"/>
+                <w:sz w:val="24"/>
+                <w:szCs w:val="24"/>
+              </w:rPr>
+            </w:pPr>
+            <w:r>
+              <w:rPr>
+                <w:rFonts w:ascii="Arial" w:hAnsi="Arial" w:cs="Arial"/>
+                <w:sz w:val="24"/>
+                <w:szCs w:val="24"/>
+              </w:rPr>
+              <w:t>Tests should execute correctly</w:t>
+            </w:r>
+          </w:p>
+        </w:tc>
+        <w:tc>
+          <w:tcPr>
+            <w:tcW w:w="2630" w:type="dxa"/>
+          </w:tcPr>
+          <w:p>
+            <w:pPr>
+              <w:jc w:val="both"/>
+              <w:rPr>
+                <w:rFonts w:ascii="Arial" w:hAnsi="Arial" w:cs="Arial"/>
+                <w:sz w:val="24"/>
+                <w:szCs w:val="24"/>
+              </w:rPr>
+            </w:pPr>
+            <w:r>
+              <w:rPr>
+                <w:rFonts w:ascii="Arial" w:hAnsi="Arial" w:cs="Arial"/>
+                <w:sz w:val="24"/>
+                <w:szCs w:val="24"/>
+              </w:rPr>
+              <w:t>Implemented missing unit tests</w:t>
+            </w:r>
+          </w:p>
+        </w:tc>
+      </w:tr>
+    </w:tbl>
+    <w:p>
+      <w:pPr>
+        <w:spacing w:line="360" w:lineRule="auto"/>
+        <w:jc w:val="both"/>
+        <w:rPr>
+          <w:rFonts w:ascii="Arial" w:hAnsi="Arial" w:cs="Arial"/>
+          <w:sz w:val="24"/>
+          <w:szCs w:val="24"/>
+        </w:rPr>
+      </w:pPr>
+    </w:p>
+    <w:p>
+      <w:pPr>
+        <w:spacing w:line="360" w:lineRule="auto"/>
+        <w:jc w:val="both"/>
+        <w:rPr>
+          <w:rFonts w:ascii="Arial" w:eastAsia="Times New Roman" w:hAnsi="Arial" w:cs="Arial"/>
+          <w:b/>
+          <w:bCs/>
+          <w:kern w:val="0"/>
+          <w:sz w:val="28"/>
+          <w:szCs w:val="28"/>
+          <w:lang w:eastAsia="en-ZA"/>
+          <w14:ligatures w14:val="none"/>
+        </w:rPr>
+      </w:pPr>
+      <w:r>
+        <w:rPr>
+          <w:rFonts w:ascii="Arial" w:eastAsia="Times New Roman" w:hAnsi="Arial" w:cs="Arial"/>
+          <w:b/>
+          <w:bCs/>
+          <w:kern w:val="0"/>
+          <w:sz w:val="28"/>
+          <w:szCs w:val="28"/>
+          <w:lang w:eastAsia="en-ZA"/>
+          <w14:ligatures w14:val="none"/>
+        </w:rPr>
+        <w:lastRenderedPageBreak/>
+        <w:t>6.2 Before Bug Fixes</w:t>
+      </w:r>
+    </w:p>
+    <w:p>
+      <w:pPr>
+        <w:spacing w:line="360" w:lineRule="auto"/>
+        <w:jc w:val="both"/>
+        <w:rPr>
+          <w:rFonts w:ascii="Arial" w:eastAsia="Times New Roman" w:hAnsi="Arial" w:cs="Arial"/>
+          <w:b/>
+          <w:bCs/>
+          <w:kern w:val="0"/>
+          <w:sz w:val="28"/>
+          <w:szCs w:val="28"/>
+          <w:lang w:eastAsia="en-ZA"/>
+          <w14:ligatures w14:val="none"/>
+        </w:rPr>
+      </w:pPr>
+    </w:p>
+    <w:p>
+      <w:pPr>
+        <w:spacing w:line="360" w:lineRule="auto"/>
+        <w:jc w:val="both"/>
+        <w:rPr>
+          <w:rFonts w:ascii="Arial" w:eastAsia="Times New Roman" w:hAnsi="Arial" w:cs="Arial"/>
+          <w:bCs/>
+          <w:kern w:val="0"/>
+          <w:sz w:val="24"/>
+          <w:szCs w:val="24"/>
+          <w:lang w:eastAsia="en-ZA"/>
+          <w14:ligatures w14:val="none"/>
+        </w:rPr>
+      </w:pPr>
+      <w:r>
+        <w:rPr>
+          <w:rFonts w:ascii="Arial" w:eastAsia="Times New Roman" w:hAnsi="Arial" w:cs="Arial"/>
+          <w:bCs/>
+          <w:kern w:val="0"/>
+          <w:sz w:val="24"/>
+          <w:szCs w:val="24"/>
+          <w:lang w:eastAsia="en-ZA"/>
+          <w14:ligatures w14:val="none"/>
+        </w:rPr>
+        <w:t>During initial testing, multiple unit test failed due to intentional logic errors in the application</w:t>
+      </w:r>
+    </w:p>
+    <w:p>
+      <w:pPr>
+        <w:spacing w:line="360" w:lineRule="auto"/>
+        <w:jc w:val="both"/>
+        <w:rPr>
+          <w:rFonts w:ascii="Arial" w:eastAsia="Times New Roman" w:hAnsi="Arial" w:cs="Arial"/>
+          <w:bCs/>
+          <w:kern w:val="0"/>
+          <w:sz w:val="24"/>
+          <w:szCs w:val="24"/>
+          <w:lang w:eastAsia="en-ZA"/>
+          <w14:ligatures w14:val="none"/>
+        </w:rPr>
+      </w:pPr>
+    </w:p>
+    <w:p>
+      <w:pPr>
+        <w:tabs>
+          <w:tab w:val="center" w:pos="4680"/>
+        </w:tabs>
+        <w:spacing w:line="360" w:lineRule="auto"/>
+        <w:jc w:val="both"/>
+        <w:rPr>
+          <w:rFonts w:ascii="Arial" w:eastAsia="Times New Roman" w:hAnsi="Arial" w:cs="Arial"/>
+          <w:b/>
+          <w:bCs/>
+          <w:kern w:val="0"/>
+          <w:sz w:val="24"/>
+          <w:szCs w:val="24"/>
+          <w:lang w:eastAsia="en-ZA"/>
+          <w14:ligatures w14:val="none"/>
+        </w:rPr>
+      </w:pPr>
+      <w:r>
+        <w:rPr>
+          <w:rFonts w:ascii="Arial" w:eastAsia="Times New Roman" w:hAnsi="Arial" w:cs="Arial"/>
+          <w:b/>
+          <w:bCs/>
+          <w:kern w:val="0"/>
+          <w:sz w:val="24"/>
+          <w:szCs w:val="24"/>
+          <w:lang w:eastAsia="en-ZA"/>
+          <w14:ligatures w14:val="none"/>
+        </w:rPr>
+        <w:t>Screenshots</w:t>
+      </w:r>
+      <w:r>
+        <w:rPr>
+          <w:rFonts w:ascii="Arial" w:eastAsia="Times New Roman" w:hAnsi="Arial" w:cs="Arial"/>
+          <w:b/>
+          <w:bCs/>
+          <w:kern w:val="0"/>
+          <w:sz w:val="24"/>
+          <w:szCs w:val="24"/>
+          <w:lang w:eastAsia="en-ZA"/>
+          <w14:ligatures w14:val="none"/>
+        </w:rPr>
+        <w:tab/>
+      </w:r>
+    </w:p>
+    <w:p>
+      <w:pPr>
+        <w:spacing w:line="360" w:lineRule="auto"/>
+        <w:jc w:val="both"/>
+        <w:rPr>
+          <w:rFonts w:ascii="Arial" w:hAnsi="Arial" w:cs="Arial"/>
+          <w:b/>
+          <w:sz w:val="24"/>
+          <w:szCs w:val="24"/>
+        </w:rPr>
+      </w:pPr>
+    </w:p>
+    <w:p>
+      <w:pPr>
+        <w:spacing w:line="360" w:lineRule="auto"/>
+        <w:jc w:val="both"/>
+        <w:rPr>
+          <w:rFonts w:ascii="Arial" w:hAnsi="Arial" w:cs="Arial"/>
+          <w:b/>
+          <w:sz w:val="24"/>
+          <w:szCs w:val="24"/>
+        </w:rPr>
+      </w:pPr>
+      <w:r>
+        <w:rPr>
+          <w:rFonts w:ascii="Arial" w:hAnsi="Arial" w:cs="Arial"/>
+          <w:b/>
+          <w:noProof/>
+          <w:sz w:val="24"/>
+          <w:szCs w:val="24"/>
+          <w:lang w:eastAsia="en-ZA"/>
+          <w14:ligatures w14:val="none"/>
+        </w:rPr>
+        <w:drawing>
+          <wp:inline distT="0" distB="0" distL="0" distR="0">
+            <wp:extent cx="5519057" cy="4755555"/>
+            <wp:effectExtent l="152400" t="152400" r="367665" b="368935"/>
+            <wp:docPr id="7" name="Picture 7"/>
+            <wp:cNvGraphicFramePr>
+              <a:graphicFrameLocks xmlns:a="http://schemas.openxmlformats.org/drawingml/2006/main" noChangeAspect="1"/>
+            </wp:cNvGraphicFramePr>
+            <a:graphic xmlns:a="http://schemas.openxmlformats.org/drawingml/2006/main">
+              <a:graphicData uri="http://schemas.openxmlformats.org/drawingml/2006/picture">
+                <pic:pic xmlns:pic="http://schemas.openxmlformats.org/drawingml/2006/picture">
+                  <pic:nvPicPr>
+                    <pic:cNvPr id="7" name="Screenshot 2026-05-12 180503.png"/>
+                    <pic:cNvPicPr/>
+                  </pic:nvPicPr>
+                  <pic:blipFill>
+                    <a:blip r:embed="rId14">
+                      <a:extLst>
+                        <a:ext uri="{28A0092B-C50C-407E-A947-70E740481C1C}">
+                          <a14:useLocalDpi xmlns:a14="http://schemas.microsoft.com/office/drawing/2010/main" val="0"/>
+                        </a:ext>
+                      </a:extLst>
+                    </a:blip>
+                    <a:stretch>
+                      <a:fillRect/>
+                    </a:stretch>
+                  </pic:blipFill>
+                  <pic:spPr>
+                    <a:xfrm>
+                      <a:off x="0" y="0"/>
+                      <a:ext cx="5582158" cy="4809927"/>
+                    </a:xfrm>
+                    <a:prstGeom prst="rect">
+                      <a:avLst/>
+                    </a:prstGeom>
+                    <a:ln>
+                      <a:noFill/>
+                    </a:ln>
+                    <a:effectLst>
+                      <a:outerShdw blurRad="292100" dist="139700" dir="2700000" algn="tl" rotWithShape="0">
+                        <a:srgbClr val="333333">
+                          <a:alpha val="65000"/>
+                        </a:srgbClr>
+                      </a:outerShdw>
+                    </a:effectLst>
+                  </pic:spPr>
+                </pic:pic>
+              </a:graphicData>
+            </a:graphic>
+          </wp:inline>
+        </w:drawing>
+      </w:r>
+    </w:p>
+    <w:p>
+      <w:pPr>
+        <w:spacing w:line="360" w:lineRule="auto"/>
+        <w:jc w:val="both"/>
+        <w:rPr>
+          <w:rFonts w:ascii="Arial" w:hAnsi="Arial" w:cs="Arial"/>
+          <w:b/>
+          <w:sz w:val="24"/>
+          <w:szCs w:val="24"/>
+        </w:rPr>
+      </w:pPr>
+    </w:p>
+    <w:p>
+      <w:pPr>
+        <w:spacing w:line="360" w:lineRule="auto"/>
+        <w:jc w:val="both"/>
+        <w:rPr>
+          <w:rFonts w:ascii="Arial" w:hAnsi="Arial" w:cs="Arial"/>
+          <w:b/>
+          <w:sz w:val="24"/>
+          <w:szCs w:val="24"/>
+        </w:rPr>
+      </w:pPr>
+    </w:p>
+    <w:p>
+      <w:pPr>
+        <w:spacing w:line="360" w:lineRule="auto"/>
+        <w:jc w:val="both"/>
+        <w:rPr>
+          <w:rFonts w:ascii="Arial" w:hAnsi="Arial" w:cs="Arial"/>
+          <w:b/>
+          <w:sz w:val="28"/>
+          <w:szCs w:val="28"/>
+        </w:rPr>
+      </w:pPr>
+      <w:r>
+        <w:rPr>
+          <w:rFonts w:ascii="Arial" w:hAnsi="Arial" w:cs="Arial"/>
+          <w:b/>
+          <w:sz w:val="28"/>
+          <w:szCs w:val="28"/>
+        </w:rPr>
+        <w:t>6.3</w:t>
+      </w:r>
+      <w:r>
+        <w:rPr>
+          <w:rFonts w:ascii="Arial" w:hAnsi="Arial" w:cs="Arial"/>
+          <w:b/>
+          <w:sz w:val="28"/>
+          <w:szCs w:val="28"/>
+        </w:rPr>
+        <w:t xml:space="preserve"> After Bug Fixes</w:t>
+      </w:r>
+    </w:p>
+    <w:p>
+      <w:pPr>
+        <w:spacing w:line="360" w:lineRule="auto"/>
+        <w:jc w:val="both"/>
+        <w:rPr>
+          <w:rFonts w:ascii="Arial" w:hAnsi="Arial" w:cs="Arial"/>
+          <w:b/>
+          <w:sz w:val="28"/>
+          <w:szCs w:val="28"/>
+        </w:rPr>
+      </w:pPr>
+    </w:p>
+    <w:p>
+      <w:pPr>
+        <w:spacing w:line="360" w:lineRule="auto"/>
+        <w:jc w:val="both"/>
+      </w:pPr>
+      <w:r>
+        <w:rPr>
+          <w:rFonts w:ascii="Arial" w:hAnsi="Arial" w:cs="Arial"/>
+          <w:sz w:val="24"/>
+          <w:szCs w:val="24"/>
+        </w:rPr>
+        <w:t>After correcting the identified logic errors and implementing missing TODO tests, all unit tests passed successfully</w:t>
+      </w:r>
+      <w:r>
+        <w:t>.</w:t>
+      </w:r>
+    </w:p>
+    <w:p>
+      <w:pPr>
+        <w:spacing w:line="360" w:lineRule="auto"/>
+        <w:jc w:val="both"/>
+        <w:rPr>
+          <w:rFonts w:ascii="Arial" w:hAnsi="Arial" w:cs="Arial"/>
+          <w:b/>
+          <w:sz w:val="28"/>
+          <w:szCs w:val="28"/>
+        </w:rPr>
+      </w:pPr>
+    </w:p>
+    <w:p>
+      <w:pPr>
+        <w:spacing w:line="360" w:lineRule="auto"/>
+        <w:jc w:val="both"/>
+        <w:rPr>
+          <w:rFonts w:ascii="Arial" w:hAnsi="Arial" w:cs="Arial"/>
+          <w:b/>
+          <w:sz w:val="24"/>
+          <w:szCs w:val="24"/>
+        </w:rPr>
+      </w:pPr>
+      <w:r>
+        <w:rPr>
+          <w:rFonts w:ascii="Arial" w:hAnsi="Arial" w:cs="Arial"/>
+          <w:b/>
+          <w:sz w:val="24"/>
+          <w:szCs w:val="24"/>
+        </w:rPr>
+        <w:t>Screenshot</w:t>
+      </w:r>
+    </w:p>
+    <w:p>
+      <w:pPr>
+        <w:spacing w:line="360" w:lineRule="auto"/>
+        <w:jc w:val="both"/>
+        <w:rPr>
+          <w:rFonts w:ascii="Arial" w:hAnsi="Arial" w:cs="Arial"/>
+          <w:b/>
+          <w:sz w:val="24"/>
+          <w:szCs w:val="24"/>
+        </w:rPr>
+      </w:pPr>
+    </w:p>
+    <w:p>
+      <w:pPr>
+        <w:spacing w:line="360" w:lineRule="auto"/>
+        <w:jc w:val="both"/>
+        <w:rPr>
+          <w:rFonts w:ascii="Arial" w:hAnsi="Arial" w:cs="Arial"/>
+          <w:b/>
+          <w:sz w:val="24"/>
+          <w:szCs w:val="24"/>
+        </w:rPr>
+      </w:pPr>
+      <w:r>
+        <w:rPr>
+          <w:rFonts w:ascii="Arial" w:hAnsi="Arial" w:cs="Arial"/>
+          <w:b/>
+          <w:noProof/>
+          <w:sz w:val="24"/>
+          <w:szCs w:val="24"/>
+          <w:lang w:eastAsia="en-ZA"/>
+          <w14:ligatures w14:val="none"/>
+        </w:rPr>
+        <w:drawing>
+          <wp:inline distT="0" distB="0" distL="0" distR="0">
+            <wp:extent cx="5889171" cy="4733290"/>
+            <wp:effectExtent l="152400" t="152400" r="359410" b="353060"/>
+            <wp:docPr id="8" name="Picture 8"/>
+            <wp:cNvGraphicFramePr>
+              <a:graphicFrameLocks xmlns:a="http://schemas.openxmlformats.org/drawingml/2006/main" noChangeAspect="1"/>
+            </wp:cNvGraphicFramePr>
+            <a:graphic xmlns:a="http://schemas.openxmlformats.org/drawingml/2006/main">
+              <a:graphicData uri="http://schemas.openxmlformats.org/drawingml/2006/picture">
+                <pic:pic xmlns:pic="http://schemas.openxmlformats.org/drawingml/2006/picture">
+                  <pic:nvPicPr>
+                    <pic:cNvPr id="8" name="Screenshot 2026-05-17 234155.png"/>
+                    <pic:cNvPicPr/>
+                  </pic:nvPicPr>
+                  <pic:blipFill>
+                    <a:blip r:embed="rId15">
+                      <a:extLst>
+                        <a:ext uri="{28A0092B-C50C-407E-A947-70E740481C1C}">
+                          <a14:useLocalDpi xmlns:a14="http://schemas.microsoft.com/office/drawing/2010/main" val="0"/>
+                        </a:ext>
+                      </a:extLst>
+                    </a:blip>
+                    <a:stretch>
+                      <a:fillRect/>
+                    </a:stretch>
+                  </pic:blipFill>
+                  <pic:spPr>
+                    <a:xfrm>
+                      <a:off x="0" y="0"/>
+                      <a:ext cx="5893713" cy="4736941"/>
+                    </a:xfrm>
+                    <a:prstGeom prst="rect">
+                      <a:avLst/>
+                    </a:prstGeom>
+                    <a:ln>
+                      <a:noFill/>
+                    </a:ln>
+                    <a:effectLst>
+                      <a:outerShdw blurRad="292100" dist="139700" dir="2700000" algn="tl" rotWithShape="0">
+                        <a:srgbClr val="333333">
+                          <a:alpha val="65000"/>
+                        </a:srgbClr>
+                      </a:outerShdw>
+                    </a:effectLst>
+                  </pic:spPr>
+                </pic:pic>
+              </a:graphicData>
+            </a:graphic>
+          </wp:inline>
+        </w:drawing>
+      </w:r>
+      <w:bookmarkStart w:id="0" w:name="_GoBack"/>
+      <w:bookmarkEnd w:id="0"/>
+    </w:p>
     <w:sectPr>
       <w:pgSz w:w="12240" w:h="15840"/>
       <w:pgMar w:top="1440" w:right="1440" w:bottom="1440" w:left="1440" w:header="720" w:footer="720" w:gutter="0"/>
@@ -1323,7 +4897,7 @@
             <w:bCs/>
             <w:noProof/>
           </w:rPr>
-          <w:t>2</w:t>
+          <w:t>4</w:t>
         </w:r>
         <w:r>
           <w:rPr>
@@ -1396,6 +4970,219 @@
     </w:p>
   </w:footnote>
 </w:footnotes>
+</file>
+
+<file path=word/numbering.xml><?xml version="1.0" encoding="utf-8"?>
+<w:numbering xmlns:wpc="http://schemas.microsoft.com/office/word/2010/wordprocessingCanvas" xmlns:cx="http://schemas.microsoft.com/office/drawing/2014/chartex" xmlns:cx1="http://schemas.microsoft.com/office/drawing/2015/9/8/chartex" xmlns:mc="http://schemas.openxmlformats.org/markup-compatibility/2006" xmlns:o="urn:schemas-microsoft-com:office:office" xmlns:r="http://schemas.openxmlformats.org/officeDocument/2006/relationships" xmlns:m="http://schemas.openxmlformats.org/officeDocument/2006/math" xmlns:v="urn:schemas-microsoft-com:vml" xmlns:wp14="http://schemas.microsoft.com/office/word/2010/wordprocessingDrawing" xmlns:wp="http://schemas.openxmlformats.org/drawingml/2006/wordprocessingDrawing" xmlns:w10="urn:schemas-microsoft-com:office:word" xmlns:w="http://schemas.openxmlformats.org/wordprocessingml/2006/main" xmlns:w14="http://schemas.microsoft.com/office/word/2010/wordml" xmlns:w15="http://schemas.microsoft.com/office/word/2012/wordml" xmlns:w16se="http://schemas.microsoft.com/office/word/2015/wordml/symex" xmlns:wpg="http://schemas.microsoft.com/office/word/2010/wordprocessingGroup" xmlns:wpi="http://schemas.microsoft.com/office/word/2010/wordprocessingInk" xmlns:wne="http://schemas.microsoft.com/office/word/2006/wordml" xmlns:wps="http://schemas.microsoft.com/office/word/2010/wordprocessingShape" mc:Ignorable="w14 w15 w16se wp14">
+  <w:abstractNum w:abstractNumId="0" w15:restartNumberingAfterBreak="0">
+    <w:nsid w:val="018F6775"/>
+    <w:multiLevelType w:val="hybridMultilevel"/>
+    <w:tmpl w:val="9F9803EE"/>
+    <w:lvl w:ilvl="0" w:tplc="1C090001">
+      <w:start w:val="1"/>
+      <w:numFmt w:val="bullet"/>
+      <w:lvlText w:val=""/>
+      <w:lvlJc w:val="left"/>
+      <w:pPr>
+        <w:ind w:left="720" w:hanging="360"/>
+      </w:pPr>
+      <w:rPr>
+        <w:rFonts w:ascii="Symbol" w:hAnsi="Symbol" w:hint="default"/>
+      </w:rPr>
+    </w:lvl>
+    <w:lvl w:ilvl="1" w:tplc="1C090003" w:tentative="1">
+      <w:start w:val="1"/>
+      <w:numFmt w:val="bullet"/>
+      <w:lvlText w:val="o"/>
+      <w:lvlJc w:val="left"/>
+      <w:pPr>
+        <w:ind w:left="1440" w:hanging="360"/>
+      </w:pPr>
+      <w:rPr>
+        <w:rFonts w:ascii="Courier New" w:hAnsi="Courier New" w:cs="Courier New" w:hint="default"/>
+      </w:rPr>
+    </w:lvl>
+    <w:lvl w:ilvl="2" w:tplc="1C090005" w:tentative="1">
+      <w:start w:val="1"/>
+      <w:numFmt w:val="bullet"/>
+      <w:lvlText w:val=""/>
+      <w:lvlJc w:val="left"/>
+      <w:pPr>
+        <w:ind w:left="2160" w:hanging="360"/>
+      </w:pPr>
+      <w:rPr>
+        <w:rFonts w:ascii="Wingdings" w:hAnsi="Wingdings" w:hint="default"/>
+      </w:rPr>
+    </w:lvl>
+    <w:lvl w:ilvl="3" w:tplc="1C090001" w:tentative="1">
+      <w:start w:val="1"/>
+      <w:numFmt w:val="bullet"/>
+      <w:lvlText w:val=""/>
+      <w:lvlJc w:val="left"/>
+      <w:pPr>
+        <w:ind w:left="2880" w:hanging="360"/>
+      </w:pPr>
+      <w:rPr>
+        <w:rFonts w:ascii="Symbol" w:hAnsi="Symbol" w:hint="default"/>
+      </w:rPr>
+    </w:lvl>
+    <w:lvl w:ilvl="4" w:tplc="1C090003" w:tentative="1">
+      <w:start w:val="1"/>
+      <w:numFmt w:val="bullet"/>
+      <w:lvlText w:val="o"/>
+      <w:lvlJc w:val="left"/>
+      <w:pPr>
+        <w:ind w:left="3600" w:hanging="360"/>
+      </w:pPr>
+      <w:rPr>
+        <w:rFonts w:ascii="Courier New" w:hAnsi="Courier New" w:cs="Courier New" w:hint="default"/>
+      </w:rPr>
+    </w:lvl>
+    <w:lvl w:ilvl="5" w:tplc="1C090005" w:tentative="1">
+      <w:start w:val="1"/>
+      <w:numFmt w:val="bullet"/>
+      <w:lvlText w:val=""/>
+      <w:lvlJc w:val="left"/>
+      <w:pPr>
+        <w:ind w:left="4320" w:hanging="360"/>
+      </w:pPr>
+      <w:rPr>
+        <w:rFonts w:ascii="Wingdings" w:hAnsi="Wingdings" w:hint="default"/>
+      </w:rPr>
+    </w:lvl>
+    <w:lvl w:ilvl="6" w:tplc="1C090001" w:tentative="1">
+      <w:start w:val="1"/>
+      <w:numFmt w:val="bullet"/>
+      <w:lvlText w:val=""/>
+      <w:lvlJc w:val="left"/>
+      <w:pPr>
+        <w:ind w:left="5040" w:hanging="360"/>
+      </w:pPr>
+      <w:rPr>
+        <w:rFonts w:ascii="Symbol" w:hAnsi="Symbol" w:hint="default"/>
+      </w:rPr>
+    </w:lvl>
+    <w:lvl w:ilvl="7" w:tplc="1C090003" w:tentative="1">
+      <w:start w:val="1"/>
+      <w:numFmt w:val="bullet"/>
+      <w:lvlText w:val="o"/>
+      <w:lvlJc w:val="left"/>
+      <w:pPr>
+        <w:ind w:left="5760" w:hanging="360"/>
+      </w:pPr>
+      <w:rPr>
+        <w:rFonts w:ascii="Courier New" w:hAnsi="Courier New" w:cs="Courier New" w:hint="default"/>
+      </w:rPr>
+    </w:lvl>
+    <w:lvl w:ilvl="8" w:tplc="1C090005" w:tentative="1">
+      <w:start w:val="1"/>
+      <w:numFmt w:val="bullet"/>
+      <w:lvlText w:val=""/>
+      <w:lvlJc w:val="left"/>
+      <w:pPr>
+        <w:ind w:left="6480" w:hanging="360"/>
+      </w:pPr>
+      <w:rPr>
+        <w:rFonts w:ascii="Wingdings" w:hAnsi="Wingdings" w:hint="default"/>
+      </w:rPr>
+    </w:lvl>
+  </w:abstractNum>
+  <w:abstractNum w:abstractNumId="1" w15:restartNumberingAfterBreak="0">
+    <w:nsid w:val="1B36142C"/>
+    <w:multiLevelType w:val="hybridMultilevel"/>
+    <w:tmpl w:val="4E9AEBA0"/>
+    <w:lvl w:ilvl="0" w:tplc="1C09000F">
+      <w:start w:val="1"/>
+      <w:numFmt w:val="decimal"/>
+      <w:lvlText w:val="%1."/>
+      <w:lvlJc w:val="left"/>
+      <w:pPr>
+        <w:ind w:left="720" w:hanging="360"/>
+      </w:pPr>
+      <w:rPr>
+        <w:rFonts w:hint="default"/>
+      </w:rPr>
+    </w:lvl>
+    <w:lvl w:ilvl="1" w:tplc="1C090019" w:tentative="1">
+      <w:start w:val="1"/>
+      <w:numFmt w:val="lowerLetter"/>
+      <w:lvlText w:val="%2."/>
+      <w:lvlJc w:val="left"/>
+      <w:pPr>
+        <w:ind w:left="1440" w:hanging="360"/>
+      </w:pPr>
+    </w:lvl>
+    <w:lvl w:ilvl="2" w:tplc="1C09001B" w:tentative="1">
+      <w:start w:val="1"/>
+      <w:numFmt w:val="lowerRoman"/>
+      <w:lvlText w:val="%3."/>
+      <w:lvlJc w:val="right"/>
+      <w:pPr>
+        <w:ind w:left="2160" w:hanging="180"/>
+      </w:pPr>
+    </w:lvl>
+    <w:lvl w:ilvl="3" w:tplc="1C09000F" w:tentative="1">
+      <w:start w:val="1"/>
+      <w:numFmt w:val="decimal"/>
+      <w:lvlText w:val="%4."/>
+      <w:lvlJc w:val="left"/>
+      <w:pPr>
+        <w:ind w:left="2880" w:hanging="360"/>
+      </w:pPr>
+    </w:lvl>
+    <w:lvl w:ilvl="4" w:tplc="1C090019" w:tentative="1">
+      <w:start w:val="1"/>
+      <w:numFmt w:val="lowerLetter"/>
+      <w:lvlText w:val="%5."/>
+      <w:lvlJc w:val="left"/>
+      <w:pPr>
+        <w:ind w:left="3600" w:hanging="360"/>
+      </w:pPr>
+    </w:lvl>
+    <w:lvl w:ilvl="5" w:tplc="1C09001B" w:tentative="1">
+      <w:start w:val="1"/>
+      <w:numFmt w:val="lowerRoman"/>
+      <w:lvlText w:val="%6."/>
+      <w:lvlJc w:val="right"/>
+      <w:pPr>
+        <w:ind w:left="4320" w:hanging="180"/>
+      </w:pPr>
+    </w:lvl>
+    <w:lvl w:ilvl="6" w:tplc="1C09000F" w:tentative="1">
+      <w:start w:val="1"/>
+      <w:numFmt w:val="decimal"/>
+      <w:lvlText w:val="%7."/>
+      <w:lvlJc w:val="left"/>
+      <w:pPr>
+        <w:ind w:left="5040" w:hanging="360"/>
+      </w:pPr>
+    </w:lvl>
+    <w:lvl w:ilvl="7" w:tplc="1C090019" w:tentative="1">
+      <w:start w:val="1"/>
+      <w:numFmt w:val="lowerLetter"/>
+      <w:lvlText w:val="%8."/>
+      <w:lvlJc w:val="left"/>
+      <w:pPr>
+        <w:ind w:left="5760" w:hanging="360"/>
+      </w:pPr>
+    </w:lvl>
+    <w:lvl w:ilvl="8" w:tplc="1C09001B" w:tentative="1">
+      <w:start w:val="1"/>
+      <w:numFmt w:val="lowerRoman"/>
+      <w:lvlText w:val="%9."/>
+      <w:lvlJc w:val="right"/>
+      <w:pPr>
+        <w:ind w:left="6480" w:hanging="180"/>
+      </w:pPr>
+    </w:lvl>
+  </w:abstractNum>
+  <w:num w:numId="1">
+    <w:abstractNumId w:val="1"/>
+  </w:num>
+  <w:num w:numId="2">
+    <w:abstractNumId w:val="0"/>
+  </w:num>
+</w:numbering>
 </file>
 
 <file path=word/styles.xml><?xml version="1.0" encoding="utf-8"?>
@@ -1798,6 +5585,28 @@
       <w14:ligatures w14:val="standardContextual"/>
     </w:rPr>
   </w:style>
+  <w:style w:type="paragraph" w:styleId="Heading2">
+    <w:name w:val="heading 2"/>
+    <w:basedOn w:val="Normal"/>
+    <w:link w:val="Heading2Char"/>
+    <w:uiPriority w:val="9"/>
+    <w:qFormat/>
+    <w:rsid w:val="00C33DBE"/>
+    <w:pPr>
+      <w:spacing w:before="100" w:beforeAutospacing="1" w:after="100" w:afterAutospacing="1" w:line="240" w:lineRule="auto"/>
+      <w:outlineLvl w:val="1"/>
+    </w:pPr>
+    <w:rPr>
+      <w:rFonts w:ascii="Times New Roman" w:eastAsia="Times New Roman" w:hAnsi="Times New Roman" w:cs="Times New Roman"/>
+      <w:b/>
+      <w:bCs/>
+      <w:kern w:val="0"/>
+      <w:sz w:val="36"/>
+      <w:szCs w:val="36"/>
+      <w:lang w:eastAsia="en-ZA"/>
+      <w14:ligatures w14:val="none"/>
+    </w:rPr>
+  </w:style>
   <w:style w:type="character" w:default="1" w:styleId="DefaultParagraphFont">
     <w:name w:val="Default Paragraph Font"/>
     <w:uiPriority w:val="1"/>
@@ -1922,6 +5731,78 @@
         <w:insideV w:val="single" w:sz="4" w:space="0" w:color="auto"/>
       </w:tblBorders>
     </w:tblPr>
+  </w:style>
+  <w:style w:type="paragraph" w:styleId="ListParagraph">
+    <w:name w:val="List Paragraph"/>
+    <w:basedOn w:val="Normal"/>
+    <w:uiPriority w:val="34"/>
+    <w:qFormat/>
+    <w:rsid w:val="00AD61B2"/>
+    <w:pPr>
+      <w:ind w:left="720"/>
+      <w:contextualSpacing/>
+    </w:pPr>
+  </w:style>
+  <w:style w:type="character" w:customStyle="1" w:styleId="Heading2Char">
+    <w:name w:val="Heading 2 Char"/>
+    <w:basedOn w:val="DefaultParagraphFont"/>
+    <w:link w:val="Heading2"/>
+    <w:uiPriority w:val="9"/>
+    <w:rsid w:val="00C33DBE"/>
+    <w:rPr>
+      <w:rFonts w:ascii="Times New Roman" w:eastAsia="Times New Roman" w:hAnsi="Times New Roman" w:cs="Times New Roman"/>
+      <w:b/>
+      <w:bCs/>
+      <w:sz w:val="36"/>
+      <w:szCs w:val="36"/>
+      <w:lang w:val="en-ZA" w:eastAsia="en-ZA"/>
+    </w:rPr>
+  </w:style>
+  <w:style w:type="paragraph" w:styleId="NormalWeb">
+    <w:name w:val="Normal (Web)"/>
+    <w:basedOn w:val="Normal"/>
+    <w:uiPriority w:val="99"/>
+    <w:semiHidden/>
+    <w:unhideWhenUsed/>
+    <w:rsid w:val="00C33DBE"/>
+    <w:pPr>
+      <w:spacing w:before="100" w:beforeAutospacing="1" w:after="100" w:afterAutospacing="1" w:line="240" w:lineRule="auto"/>
+    </w:pPr>
+    <w:rPr>
+      <w:rFonts w:ascii="Times New Roman" w:eastAsia="Times New Roman" w:hAnsi="Times New Roman" w:cs="Times New Roman"/>
+      <w:kern w:val="0"/>
+      <w:sz w:val="24"/>
+      <w:szCs w:val="24"/>
+      <w:lang w:eastAsia="en-ZA"/>
+      <w14:ligatures w14:val="none"/>
+    </w:rPr>
+  </w:style>
+  <w:style w:type="paragraph" w:styleId="Header">
+    <w:name w:val="header"/>
+    <w:basedOn w:val="Normal"/>
+    <w:link w:val="HeaderChar"/>
+    <w:uiPriority w:val="99"/>
+    <w:unhideWhenUsed/>
+    <w:rsid w:val="00502D42"/>
+    <w:pPr>
+      <w:tabs>
+        <w:tab w:val="center" w:pos="4513"/>
+        <w:tab w:val="right" w:pos="9026"/>
+      </w:tabs>
+      <w:spacing w:after="0" w:line="240" w:lineRule="auto"/>
+    </w:pPr>
+  </w:style>
+  <w:style w:type="character" w:customStyle="1" w:styleId="HeaderChar">
+    <w:name w:val="Header Char"/>
+    <w:basedOn w:val="DefaultParagraphFont"/>
+    <w:link w:val="Header"/>
+    <w:uiPriority w:val="99"/>
+    <w:rsid w:val="00502D42"/>
+    <w:rPr>
+      <w:kern w:val="2"/>
+      <w:lang w:val="en-ZA"/>
+      <w14:ligatures w14:val="standardContextual"/>
+    </w:rPr>
   </w:style>
 </w:styles>
 </file>

</xml_diff>